<commit_message>
feat(Version10): add W.2/W.3 web adapter and Lightsail deployment assets
Ship the Version10 production web path, Gunicorn/Nginx/systemd units, and W.3 delivery report. Include E.3 diameter-wise report updates and live hybrid results.

Co-authored-by: Cursor <cursoragent@cursor.com>
</commit_message>
<xml_diff>
--- a/Version10/data/output/PhaseP2610E3_second_to_sixth_full_population_live_vision_hybrid_accuracy_benchmark/Steel_Beam_Estimation_Current_Hybrid_Performance_Report_Second_to_Sixth_Sets.docx
+++ b/Version10/data/output/PhaseP2610E3_second_to_sixth_full_population_live_vision_hybrid_accuracy_benchmark/Steel_Beam_Estimation_Current_Hybrid_Performance_Report_Second_to_Sixth_Sets.docx
@@ -6079,7 +6079,3481 @@
                 <w:color w:val="FFFFFF"/>
                 <w:sz w:val="22"/>
               </w:rPr>
-              <w:t>7.  Semantic error profile</w:t>
+              <w:t>7.  Diameter identification (detected bar lines)</w:t>
+            </w:r>
+          </w:p>
+        </w:tc>
+      </w:tr>
+    </w:tbl>
+    <w:p>
+      <w:pPr>
+        <w:spacing w:after="60"/>
+      </w:pPr>
+    </w:p>
+    <w:p>
+      <w:pPr>
+        <w:spacing w:after="100" w:before="0" w:line="259" w:lineRule="auto"/>
+      </w:pPr>
+      <w:r>
+        <w:rPr>
+          <w:rFonts w:ascii="Calibri" w:hAnsi="Calibri" w:eastAsia="Calibri"/>
+          <w:b w:val="0"/>
+          <w:color w:val="3D4A57"/>
+          <w:sz w:val="18"/>
+        </w:rPr>
+        <w:t>QA.2A’s published field diameter_accuracy_pct is an alias of bar matching accuracy (MATCH / detected) and is not used here. Diameter identification below is counted from Bar Matching rows: a detected bar is diameter-correct unless status is WRONG_DIAMETER. GT diameter is the estimator line diameter. Percentages are pooled from raw counts across Second–Sixth; set percentages are not averaged. Diameter remains excluded from overall.</w:t>
+      </w:r>
+    </w:p>
+    <w:tbl>
+      <w:tblPr>
+        <w:tblW w:type="dxa" w:w="9639"/>
+        <w:jc w:val="center"/>
+        <w:tblLayout w:type="fixed"/>
+        <w:tblLook w:firstColumn="1" w:firstRow="1" w:lastColumn="0" w:lastRow="0" w:noHBand="0" w:noVBand="1" w:val="04A0"/>
+      </w:tblPr>
+      <w:tblGrid>
+        <w:gridCol w:w="1425"/>
+        <w:gridCol w:w="1425"/>
+        <w:gridCol w:w="1425"/>
+        <w:gridCol w:w="1425"/>
+        <w:gridCol w:w="1425"/>
+        <w:gridCol w:w="1425"/>
+        <w:gridCol w:w="1425"/>
+      </w:tblGrid>
+      <w:tr>
+        <w:tc>
+          <w:tcPr>
+            <w:tcW w:type="dxa" w:w="1361"/>
+            <w:shd w:fill="1B365D" w:val="clear"/>
+            <w:tcBorders>
+              <w:top w:val="single" w:sz="4" w:space="0" w:color="C5CDD6"/>
+              <w:left w:val="single" w:sz="4" w:space="0" w:color="C5CDD6"/>
+              <w:bottom w:val="single" w:sz="4" w:space="0" w:color="C5CDD6"/>
+              <w:right w:val="single" w:sz="4" w:space="0" w:color="C5CDD6"/>
+            </w:tcBorders>
+          </w:tcPr>
+          <w:p>
+            <w:pPr>
+              <w:spacing w:before="20" w:after="20"/>
+              <w:jc w:val="center"/>
+            </w:pPr>
+            <w:r/>
+            <w:r>
+              <w:rPr>
+                <w:rFonts w:ascii="Calibri" w:hAnsi="Calibri" w:eastAsia="Calibri"/>
+                <w:b/>
+                <w:color w:val="FFFFFF"/>
+                <w:sz w:val="15"/>
+              </w:rPr>
+              <w:t>Diameter</w:t>
+            </w:r>
+          </w:p>
+        </w:tc>
+        <w:tc>
+          <w:tcPr>
+            <w:tcW w:type="dxa" w:w="1247"/>
+            <w:shd w:fill="1B365D" w:val="clear"/>
+            <w:tcBorders>
+              <w:top w:val="single" w:sz="4" w:space="0" w:color="C5CDD6"/>
+              <w:left w:val="single" w:sz="4" w:space="0" w:color="C5CDD6"/>
+              <w:bottom w:val="single" w:sz="4" w:space="0" w:color="C5CDD6"/>
+              <w:right w:val="single" w:sz="4" w:space="0" w:color="C5CDD6"/>
+            </w:tcBorders>
+          </w:tcPr>
+          <w:p>
+            <w:pPr>
+              <w:spacing w:before="20" w:after="20"/>
+              <w:jc w:val="center"/>
+            </w:pPr>
+            <w:r/>
+            <w:r>
+              <w:rPr>
+                <w:rFonts w:ascii="Calibri" w:hAnsi="Calibri" w:eastAsia="Calibri"/>
+                <w:b/>
+                <w:color w:val="FFFFFF"/>
+                <w:sz w:val="15"/>
+              </w:rPr>
+              <w:t>GT bar lines</w:t>
+            </w:r>
+          </w:p>
+        </w:tc>
+        <w:tc>
+          <w:tcPr>
+            <w:tcW w:type="dxa" w:w="1020"/>
+            <w:shd w:fill="1B365D" w:val="clear"/>
+            <w:tcBorders>
+              <w:top w:val="single" w:sz="4" w:space="0" w:color="C5CDD6"/>
+              <w:left w:val="single" w:sz="4" w:space="0" w:color="C5CDD6"/>
+              <w:bottom w:val="single" w:sz="4" w:space="0" w:color="C5CDD6"/>
+              <w:right w:val="single" w:sz="4" w:space="0" w:color="C5CDD6"/>
+            </w:tcBorders>
+          </w:tcPr>
+          <w:p>
+            <w:pPr>
+              <w:spacing w:before="20" w:after="20"/>
+              <w:jc w:val="center"/>
+            </w:pPr>
+            <w:r/>
+            <w:r>
+              <w:rPr>
+                <w:rFonts w:ascii="Calibri" w:hAnsi="Calibri" w:eastAsia="Calibri"/>
+                <w:b/>
+                <w:color w:val="FFFFFF"/>
+                <w:sz w:val="15"/>
+              </w:rPr>
+              <w:t>Detected</w:t>
+            </w:r>
+          </w:p>
+        </w:tc>
+        <w:tc>
+          <w:tcPr>
+            <w:tcW w:type="dxa" w:w="907"/>
+            <w:shd w:fill="1B365D" w:val="clear"/>
+            <w:tcBorders>
+              <w:top w:val="single" w:sz="4" w:space="0" w:color="C5CDD6"/>
+              <w:left w:val="single" w:sz="4" w:space="0" w:color="C5CDD6"/>
+              <w:bottom w:val="single" w:sz="4" w:space="0" w:color="C5CDD6"/>
+              <w:right w:val="single" w:sz="4" w:space="0" w:color="C5CDD6"/>
+            </w:tcBorders>
+          </w:tcPr>
+          <w:p>
+            <w:pPr>
+              <w:spacing w:before="20" w:after="20"/>
+              <w:jc w:val="center"/>
+            </w:pPr>
+            <w:r/>
+            <w:r>
+              <w:rPr>
+                <w:rFonts w:ascii="Calibri" w:hAnsi="Calibri" w:eastAsia="Calibri"/>
+                <w:b/>
+                <w:color w:val="FFFFFF"/>
+                <w:sz w:val="15"/>
+              </w:rPr>
+              <w:t>MATCH</w:t>
+            </w:r>
+          </w:p>
+        </w:tc>
+        <w:tc>
+          <w:tcPr>
+            <w:tcW w:type="dxa" w:w="1134"/>
+            <w:shd w:fill="1B365D" w:val="clear"/>
+            <w:tcBorders>
+              <w:top w:val="single" w:sz="4" w:space="0" w:color="C5CDD6"/>
+              <w:left w:val="single" w:sz="4" w:space="0" w:color="C5CDD6"/>
+              <w:bottom w:val="single" w:sz="4" w:space="0" w:color="C5CDD6"/>
+              <w:right w:val="single" w:sz="4" w:space="0" w:color="C5CDD6"/>
+            </w:tcBorders>
+          </w:tcPr>
+          <w:p>
+            <w:pPr>
+              <w:spacing w:before="20" w:after="20"/>
+              <w:jc w:val="center"/>
+            </w:pPr>
+            <w:r/>
+            <w:r>
+              <w:rPr>
+                <w:rFonts w:ascii="Calibri" w:hAnsi="Calibri" w:eastAsia="Calibri"/>
+                <w:b/>
+                <w:color w:val="FFFFFF"/>
+                <w:sz w:val="15"/>
+              </w:rPr>
+              <w:t>WRONG_DIA</w:t>
+            </w:r>
+          </w:p>
+        </w:tc>
+        <w:tc>
+          <w:tcPr>
+            <w:tcW w:type="dxa" w:w="1247"/>
+            <w:shd w:fill="1B365D" w:val="clear"/>
+            <w:tcBorders>
+              <w:top w:val="single" w:sz="4" w:space="0" w:color="C5CDD6"/>
+              <w:left w:val="single" w:sz="4" w:space="0" w:color="C5CDD6"/>
+              <w:bottom w:val="single" w:sz="4" w:space="0" w:color="C5CDD6"/>
+              <w:right w:val="single" w:sz="4" w:space="0" w:color="C5CDD6"/>
+            </w:tcBorders>
+          </w:tcPr>
+          <w:p>
+            <w:pPr>
+              <w:spacing w:before="20" w:after="20"/>
+              <w:jc w:val="center"/>
+            </w:pPr>
+            <w:r/>
+            <w:r>
+              <w:rPr>
+                <w:rFonts w:ascii="Calibri" w:hAnsi="Calibri" w:eastAsia="Calibri"/>
+                <w:b/>
+                <w:color w:val="FFFFFF"/>
+                <w:sz w:val="15"/>
+              </w:rPr>
+              <w:t>Diameter ID</w:t>
+            </w:r>
+          </w:p>
+        </w:tc>
+        <w:tc>
+          <w:tcPr>
+            <w:tcW w:type="dxa" w:w="2721"/>
+            <w:shd w:fill="1B365D" w:val="clear"/>
+            <w:tcBorders>
+              <w:top w:val="single" w:sz="4" w:space="0" w:color="C5CDD6"/>
+              <w:left w:val="single" w:sz="4" w:space="0" w:color="C5CDD6"/>
+              <w:bottom w:val="single" w:sz="4" w:space="0" w:color="C5CDD6"/>
+              <w:right w:val="single" w:sz="4" w:space="0" w:color="C5CDD6"/>
+            </w:tcBorders>
+          </w:tcPr>
+          <w:p>
+            <w:pPr>
+              <w:spacing w:before="20" w:after="20"/>
+              <w:jc w:val="center"/>
+            </w:pPr>
+            <w:r/>
+            <w:r>
+              <w:rPr>
+                <w:rFonts w:ascii="Calibri" w:hAnsi="Calibri" w:eastAsia="Calibri"/>
+                <w:b/>
+                <w:color w:val="FFFFFF"/>
+                <w:sz w:val="15"/>
+              </w:rPr>
+              <w:t>Note</w:t>
+            </w:r>
+          </w:p>
+        </w:tc>
+      </w:tr>
+      <w:tr>
+        <w:tc>
+          <w:tcPr>
+            <w:tcW w:type="dxa" w:w="1361"/>
+            <w:shd w:fill="FFFFFF" w:val="clear"/>
+            <w:tcBorders>
+              <w:top w:val="single" w:sz="4" w:space="0" w:color="C5CDD6"/>
+              <w:left w:val="single" w:sz="4" w:space="0" w:color="C5CDD6"/>
+              <w:bottom w:val="single" w:sz="4" w:space="0" w:color="C5CDD6"/>
+              <w:right w:val="single" w:sz="4" w:space="0" w:color="C5CDD6"/>
+            </w:tcBorders>
+          </w:tcPr>
+          <w:p>
+            <w:pPr>
+              <w:spacing w:before="20" w:after="20"/>
+              <w:jc w:val="left"/>
+            </w:pPr>
+            <w:r/>
+            <w:r>
+              <w:rPr>
+                <w:rFonts w:ascii="Calibri" w:hAnsi="Calibri" w:eastAsia="Calibri"/>
+                <w:b/>
+                <w:color w:val="1B365D"/>
+                <w:sz w:val="16"/>
+              </w:rPr>
+              <w:t>Ø8</w:t>
+            </w:r>
+          </w:p>
+        </w:tc>
+        <w:tc>
+          <w:tcPr>
+            <w:tcW w:type="dxa" w:w="1247"/>
+            <w:shd w:fill="FFFFFF" w:val="clear"/>
+            <w:tcBorders>
+              <w:top w:val="single" w:sz="4" w:space="0" w:color="C5CDD6"/>
+              <w:left w:val="single" w:sz="4" w:space="0" w:color="C5CDD6"/>
+              <w:bottom w:val="single" w:sz="4" w:space="0" w:color="C5CDD6"/>
+              <w:right w:val="single" w:sz="4" w:space="0" w:color="C5CDD6"/>
+            </w:tcBorders>
+          </w:tcPr>
+          <w:p>
+            <w:pPr>
+              <w:spacing w:before="20" w:after="20"/>
+              <w:jc w:val="center"/>
+            </w:pPr>
+            <w:r/>
+            <w:r>
+              <w:rPr>
+                <w:rFonts w:ascii="Calibri" w:hAnsi="Calibri" w:eastAsia="Calibri"/>
+                <w:b w:val="0"/>
+                <w:color w:val="3D4A57"/>
+                <w:sz w:val="16"/>
+              </w:rPr>
+              <w:t>358</w:t>
+            </w:r>
+          </w:p>
+        </w:tc>
+        <w:tc>
+          <w:tcPr>
+            <w:tcW w:type="dxa" w:w="1020"/>
+            <w:shd w:fill="FFFFFF" w:val="clear"/>
+            <w:tcBorders>
+              <w:top w:val="single" w:sz="4" w:space="0" w:color="C5CDD6"/>
+              <w:left w:val="single" w:sz="4" w:space="0" w:color="C5CDD6"/>
+              <w:bottom w:val="single" w:sz="4" w:space="0" w:color="C5CDD6"/>
+              <w:right w:val="single" w:sz="4" w:space="0" w:color="C5CDD6"/>
+            </w:tcBorders>
+          </w:tcPr>
+          <w:p>
+            <w:pPr>
+              <w:spacing w:before="20" w:after="20"/>
+              <w:jc w:val="center"/>
+            </w:pPr>
+            <w:r/>
+            <w:r>
+              <w:rPr>
+                <w:rFonts w:ascii="Calibri" w:hAnsi="Calibri" w:eastAsia="Calibri"/>
+                <w:b w:val="0"/>
+                <w:color w:val="3D4A57"/>
+                <w:sz w:val="16"/>
+              </w:rPr>
+              <w:t>152</w:t>
+            </w:r>
+          </w:p>
+        </w:tc>
+        <w:tc>
+          <w:tcPr>
+            <w:tcW w:type="dxa" w:w="907"/>
+            <w:shd w:fill="FFFFFF" w:val="clear"/>
+            <w:tcBorders>
+              <w:top w:val="single" w:sz="4" w:space="0" w:color="C5CDD6"/>
+              <w:left w:val="single" w:sz="4" w:space="0" w:color="C5CDD6"/>
+              <w:bottom w:val="single" w:sz="4" w:space="0" w:color="C5CDD6"/>
+              <w:right w:val="single" w:sz="4" w:space="0" w:color="C5CDD6"/>
+            </w:tcBorders>
+          </w:tcPr>
+          <w:p>
+            <w:pPr>
+              <w:spacing w:before="20" w:after="20"/>
+              <w:jc w:val="center"/>
+            </w:pPr>
+            <w:r/>
+            <w:r>
+              <w:rPr>
+                <w:rFonts w:ascii="Calibri" w:hAnsi="Calibri" w:eastAsia="Calibri"/>
+                <w:b w:val="0"/>
+                <w:color w:val="3D4A57"/>
+                <w:sz w:val="16"/>
+              </w:rPr>
+              <w:t>32</w:t>
+            </w:r>
+          </w:p>
+        </w:tc>
+        <w:tc>
+          <w:tcPr>
+            <w:tcW w:type="dxa" w:w="1134"/>
+            <w:shd w:fill="FFFFFF" w:val="clear"/>
+            <w:tcBorders>
+              <w:top w:val="single" w:sz="4" w:space="0" w:color="C5CDD6"/>
+              <w:left w:val="single" w:sz="4" w:space="0" w:color="C5CDD6"/>
+              <w:bottom w:val="single" w:sz="4" w:space="0" w:color="C5CDD6"/>
+              <w:right w:val="single" w:sz="4" w:space="0" w:color="C5CDD6"/>
+            </w:tcBorders>
+          </w:tcPr>
+          <w:p>
+            <w:pPr>
+              <w:spacing w:before="20" w:after="20"/>
+              <w:jc w:val="center"/>
+            </w:pPr>
+            <w:r/>
+            <w:r>
+              <w:rPr>
+                <w:rFonts w:ascii="Calibri" w:hAnsi="Calibri" w:eastAsia="Calibri"/>
+                <w:b w:val="0"/>
+                <w:color w:val="3D4A57"/>
+                <w:sz w:val="16"/>
+              </w:rPr>
+              <w:t>3</w:t>
+            </w:r>
+          </w:p>
+        </w:tc>
+        <w:tc>
+          <w:tcPr>
+            <w:tcW w:type="dxa" w:w="1247"/>
+            <w:shd w:fill="FFFFFF" w:val="clear"/>
+            <w:tcBorders>
+              <w:top w:val="single" w:sz="4" w:space="0" w:color="C5CDD6"/>
+              <w:left w:val="single" w:sz="4" w:space="0" w:color="C5CDD6"/>
+              <w:bottom w:val="single" w:sz="4" w:space="0" w:color="C5CDD6"/>
+              <w:right w:val="single" w:sz="4" w:space="0" w:color="C5CDD6"/>
+            </w:tcBorders>
+          </w:tcPr>
+          <w:p>
+            <w:pPr>
+              <w:spacing w:before="20" w:after="20"/>
+              <w:jc w:val="center"/>
+            </w:pPr>
+            <w:r/>
+            <w:r>
+              <w:rPr>
+                <w:rFonts w:ascii="Calibri" w:hAnsi="Calibri" w:eastAsia="Calibri"/>
+                <w:b w:val="0"/>
+                <w:color w:val="3D4A57"/>
+                <w:sz w:val="16"/>
+              </w:rPr>
+              <w:t>98.03%</w:t>
+            </w:r>
+          </w:p>
+        </w:tc>
+        <w:tc>
+          <w:tcPr>
+            <w:tcW w:type="dxa" w:w="2721"/>
+            <w:shd w:fill="FFFFFF" w:val="clear"/>
+            <w:tcBorders>
+              <w:top w:val="single" w:sz="4" w:space="0" w:color="C5CDD6"/>
+              <w:left w:val="single" w:sz="4" w:space="0" w:color="C5CDD6"/>
+              <w:bottom w:val="single" w:sz="4" w:space="0" w:color="C5CDD6"/>
+              <w:right w:val="single" w:sz="4" w:space="0" w:color="C5CDD6"/>
+            </w:tcBorders>
+          </w:tcPr>
+          <w:p>
+            <w:pPr>
+              <w:spacing w:before="20" w:after="20"/>
+              <w:jc w:val="center"/>
+            </w:pPr>
+            <w:r/>
+            <w:r>
+              <w:rPr>
+                <w:rFonts w:ascii="Calibri" w:hAnsi="Calibri" w:eastAsia="Calibri"/>
+                <w:b w:val="0"/>
+                <w:color w:val="3D4A57"/>
+                <w:sz w:val="16"/>
+              </w:rPr>
+              <w:t>Usually right when found; many missing</w:t>
+            </w:r>
+          </w:p>
+        </w:tc>
+      </w:tr>
+      <w:tr>
+        <w:tc>
+          <w:tcPr>
+            <w:tcW w:type="dxa" w:w="1361"/>
+            <w:shd w:fill="F4F7FA" w:val="clear"/>
+            <w:tcBorders>
+              <w:top w:val="single" w:sz="4" w:space="0" w:color="C5CDD6"/>
+              <w:left w:val="single" w:sz="4" w:space="0" w:color="C5CDD6"/>
+              <w:bottom w:val="single" w:sz="4" w:space="0" w:color="C5CDD6"/>
+              <w:right w:val="single" w:sz="4" w:space="0" w:color="C5CDD6"/>
+            </w:tcBorders>
+          </w:tcPr>
+          <w:p>
+            <w:pPr>
+              <w:spacing w:before="20" w:after="20"/>
+              <w:jc w:val="left"/>
+            </w:pPr>
+            <w:r/>
+            <w:r>
+              <w:rPr>
+                <w:rFonts w:ascii="Calibri" w:hAnsi="Calibri" w:eastAsia="Calibri"/>
+                <w:b/>
+                <w:color w:val="1B365D"/>
+                <w:sz w:val="16"/>
+              </w:rPr>
+              <w:t>Ø10</w:t>
+            </w:r>
+          </w:p>
+        </w:tc>
+        <w:tc>
+          <w:tcPr>
+            <w:tcW w:type="dxa" w:w="1247"/>
+            <w:shd w:fill="F4F7FA" w:val="clear"/>
+            <w:tcBorders>
+              <w:top w:val="single" w:sz="4" w:space="0" w:color="C5CDD6"/>
+              <w:left w:val="single" w:sz="4" w:space="0" w:color="C5CDD6"/>
+              <w:bottom w:val="single" w:sz="4" w:space="0" w:color="C5CDD6"/>
+              <w:right w:val="single" w:sz="4" w:space="0" w:color="C5CDD6"/>
+            </w:tcBorders>
+          </w:tcPr>
+          <w:p>
+            <w:pPr>
+              <w:spacing w:before="20" w:after="20"/>
+              <w:jc w:val="center"/>
+            </w:pPr>
+            <w:r/>
+            <w:r>
+              <w:rPr>
+                <w:rFonts w:ascii="Calibri" w:hAnsi="Calibri" w:eastAsia="Calibri"/>
+                <w:b w:val="0"/>
+                <w:color w:val="3D4A57"/>
+                <w:sz w:val="16"/>
+              </w:rPr>
+              <w:t>714</w:t>
+            </w:r>
+          </w:p>
+        </w:tc>
+        <w:tc>
+          <w:tcPr>
+            <w:tcW w:type="dxa" w:w="1020"/>
+            <w:shd w:fill="F4F7FA" w:val="clear"/>
+            <w:tcBorders>
+              <w:top w:val="single" w:sz="4" w:space="0" w:color="C5CDD6"/>
+              <w:left w:val="single" w:sz="4" w:space="0" w:color="C5CDD6"/>
+              <w:bottom w:val="single" w:sz="4" w:space="0" w:color="C5CDD6"/>
+              <w:right w:val="single" w:sz="4" w:space="0" w:color="C5CDD6"/>
+            </w:tcBorders>
+          </w:tcPr>
+          <w:p>
+            <w:pPr>
+              <w:spacing w:before="20" w:after="20"/>
+              <w:jc w:val="center"/>
+            </w:pPr>
+            <w:r/>
+            <w:r>
+              <w:rPr>
+                <w:rFonts w:ascii="Calibri" w:hAnsi="Calibri" w:eastAsia="Calibri"/>
+                <w:b w:val="0"/>
+                <w:color w:val="3D4A57"/>
+                <w:sz w:val="16"/>
+              </w:rPr>
+              <w:t>214</w:t>
+            </w:r>
+          </w:p>
+        </w:tc>
+        <w:tc>
+          <w:tcPr>
+            <w:tcW w:type="dxa" w:w="907"/>
+            <w:shd w:fill="F4F7FA" w:val="clear"/>
+            <w:tcBorders>
+              <w:top w:val="single" w:sz="4" w:space="0" w:color="C5CDD6"/>
+              <w:left w:val="single" w:sz="4" w:space="0" w:color="C5CDD6"/>
+              <w:bottom w:val="single" w:sz="4" w:space="0" w:color="C5CDD6"/>
+              <w:right w:val="single" w:sz="4" w:space="0" w:color="C5CDD6"/>
+            </w:tcBorders>
+          </w:tcPr>
+          <w:p>
+            <w:pPr>
+              <w:spacing w:before="20" w:after="20"/>
+              <w:jc w:val="center"/>
+            </w:pPr>
+            <w:r/>
+            <w:r>
+              <w:rPr>
+                <w:rFonts w:ascii="Calibri" w:hAnsi="Calibri" w:eastAsia="Calibri"/>
+                <w:b w:val="0"/>
+                <w:color w:val="3D4A57"/>
+                <w:sz w:val="16"/>
+              </w:rPr>
+              <w:t>56</w:t>
+            </w:r>
+          </w:p>
+        </w:tc>
+        <w:tc>
+          <w:tcPr>
+            <w:tcW w:type="dxa" w:w="1134"/>
+            <w:shd w:fill="F4F7FA" w:val="clear"/>
+            <w:tcBorders>
+              <w:top w:val="single" w:sz="4" w:space="0" w:color="C5CDD6"/>
+              <w:left w:val="single" w:sz="4" w:space="0" w:color="C5CDD6"/>
+              <w:bottom w:val="single" w:sz="4" w:space="0" w:color="C5CDD6"/>
+              <w:right w:val="single" w:sz="4" w:space="0" w:color="C5CDD6"/>
+            </w:tcBorders>
+          </w:tcPr>
+          <w:p>
+            <w:pPr>
+              <w:spacing w:before="20" w:after="20"/>
+              <w:jc w:val="center"/>
+            </w:pPr>
+            <w:r/>
+            <w:r>
+              <w:rPr>
+                <w:rFonts w:ascii="Calibri" w:hAnsi="Calibri" w:eastAsia="Calibri"/>
+                <w:b w:val="0"/>
+                <w:color w:val="3D4A57"/>
+                <w:sz w:val="16"/>
+              </w:rPr>
+              <w:t>11</w:t>
+            </w:r>
+          </w:p>
+        </w:tc>
+        <w:tc>
+          <w:tcPr>
+            <w:tcW w:type="dxa" w:w="1247"/>
+            <w:shd w:fill="F4F7FA" w:val="clear"/>
+            <w:tcBorders>
+              <w:top w:val="single" w:sz="4" w:space="0" w:color="C5CDD6"/>
+              <w:left w:val="single" w:sz="4" w:space="0" w:color="C5CDD6"/>
+              <w:bottom w:val="single" w:sz="4" w:space="0" w:color="C5CDD6"/>
+              <w:right w:val="single" w:sz="4" w:space="0" w:color="C5CDD6"/>
+            </w:tcBorders>
+          </w:tcPr>
+          <w:p>
+            <w:pPr>
+              <w:spacing w:before="20" w:after="20"/>
+              <w:jc w:val="center"/>
+            </w:pPr>
+            <w:r/>
+            <w:r>
+              <w:rPr>
+                <w:rFonts w:ascii="Calibri" w:hAnsi="Calibri" w:eastAsia="Calibri"/>
+                <w:b w:val="0"/>
+                <w:color w:val="3D4A57"/>
+                <w:sz w:val="16"/>
+              </w:rPr>
+              <w:t>94.86%</w:t>
+            </w:r>
+          </w:p>
+        </w:tc>
+        <w:tc>
+          <w:tcPr>
+            <w:tcW w:type="dxa" w:w="2721"/>
+            <w:shd w:fill="F4F7FA" w:val="clear"/>
+            <w:tcBorders>
+              <w:top w:val="single" w:sz="4" w:space="0" w:color="C5CDD6"/>
+              <w:left w:val="single" w:sz="4" w:space="0" w:color="C5CDD6"/>
+              <w:bottom w:val="single" w:sz="4" w:space="0" w:color="C5CDD6"/>
+              <w:right w:val="single" w:sz="4" w:space="0" w:color="C5CDD6"/>
+            </w:tcBorders>
+          </w:tcPr>
+          <w:p>
+            <w:pPr>
+              <w:spacing w:before="20" w:after="20"/>
+              <w:jc w:val="center"/>
+            </w:pPr>
+            <w:r/>
+            <w:r>
+              <w:rPr>
+                <w:rFonts w:ascii="Calibri" w:hAnsi="Calibri" w:eastAsia="Calibri"/>
+                <w:b w:val="0"/>
+                <w:color w:val="3D4A57"/>
+                <w:sz w:val="16"/>
+              </w:rPr>
+              <w:t>Usually right when found; many missing</w:t>
+            </w:r>
+          </w:p>
+        </w:tc>
+      </w:tr>
+      <w:tr>
+        <w:tc>
+          <w:tcPr>
+            <w:tcW w:type="dxa" w:w="1361"/>
+            <w:shd w:fill="FFFFFF" w:val="clear"/>
+            <w:tcBorders>
+              <w:top w:val="single" w:sz="4" w:space="0" w:color="C5CDD6"/>
+              <w:left w:val="single" w:sz="4" w:space="0" w:color="C5CDD6"/>
+              <w:bottom w:val="single" w:sz="4" w:space="0" w:color="C5CDD6"/>
+              <w:right w:val="single" w:sz="4" w:space="0" w:color="C5CDD6"/>
+            </w:tcBorders>
+          </w:tcPr>
+          <w:p>
+            <w:pPr>
+              <w:spacing w:before="20" w:after="20"/>
+              <w:jc w:val="left"/>
+            </w:pPr>
+            <w:r/>
+            <w:r>
+              <w:rPr>
+                <w:rFonts w:ascii="Calibri" w:hAnsi="Calibri" w:eastAsia="Calibri"/>
+                <w:b/>
+                <w:color w:val="1B365D"/>
+                <w:sz w:val="16"/>
+              </w:rPr>
+              <w:t>Ø12</w:t>
+            </w:r>
+          </w:p>
+        </w:tc>
+        <w:tc>
+          <w:tcPr>
+            <w:tcW w:type="dxa" w:w="1247"/>
+            <w:shd w:fill="FFFFFF" w:val="clear"/>
+            <w:tcBorders>
+              <w:top w:val="single" w:sz="4" w:space="0" w:color="C5CDD6"/>
+              <w:left w:val="single" w:sz="4" w:space="0" w:color="C5CDD6"/>
+              <w:bottom w:val="single" w:sz="4" w:space="0" w:color="C5CDD6"/>
+              <w:right w:val="single" w:sz="4" w:space="0" w:color="C5CDD6"/>
+            </w:tcBorders>
+          </w:tcPr>
+          <w:p>
+            <w:pPr>
+              <w:spacing w:before="20" w:after="20"/>
+              <w:jc w:val="center"/>
+            </w:pPr>
+            <w:r/>
+            <w:r>
+              <w:rPr>
+                <w:rFonts w:ascii="Calibri" w:hAnsi="Calibri" w:eastAsia="Calibri"/>
+                <w:b w:val="0"/>
+                <w:color w:val="3D4A57"/>
+                <w:sz w:val="16"/>
+              </w:rPr>
+              <w:t>573</w:t>
+            </w:r>
+          </w:p>
+        </w:tc>
+        <w:tc>
+          <w:tcPr>
+            <w:tcW w:type="dxa" w:w="1020"/>
+            <w:shd w:fill="FFFFFF" w:val="clear"/>
+            <w:tcBorders>
+              <w:top w:val="single" w:sz="4" w:space="0" w:color="C5CDD6"/>
+              <w:left w:val="single" w:sz="4" w:space="0" w:color="C5CDD6"/>
+              <w:bottom w:val="single" w:sz="4" w:space="0" w:color="C5CDD6"/>
+              <w:right w:val="single" w:sz="4" w:space="0" w:color="C5CDD6"/>
+            </w:tcBorders>
+          </w:tcPr>
+          <w:p>
+            <w:pPr>
+              <w:spacing w:before="20" w:after="20"/>
+              <w:jc w:val="center"/>
+            </w:pPr>
+            <w:r/>
+            <w:r>
+              <w:rPr>
+                <w:rFonts w:ascii="Calibri" w:hAnsi="Calibri" w:eastAsia="Calibri"/>
+                <w:b w:val="0"/>
+                <w:color w:val="3D4A57"/>
+                <w:sz w:val="16"/>
+              </w:rPr>
+              <w:t>207</w:t>
+            </w:r>
+          </w:p>
+        </w:tc>
+        <w:tc>
+          <w:tcPr>
+            <w:tcW w:type="dxa" w:w="907"/>
+            <w:shd w:fill="FFFFFF" w:val="clear"/>
+            <w:tcBorders>
+              <w:top w:val="single" w:sz="4" w:space="0" w:color="C5CDD6"/>
+              <w:left w:val="single" w:sz="4" w:space="0" w:color="C5CDD6"/>
+              <w:bottom w:val="single" w:sz="4" w:space="0" w:color="C5CDD6"/>
+              <w:right w:val="single" w:sz="4" w:space="0" w:color="C5CDD6"/>
+            </w:tcBorders>
+          </w:tcPr>
+          <w:p>
+            <w:pPr>
+              <w:spacing w:before="20" w:after="20"/>
+              <w:jc w:val="center"/>
+            </w:pPr>
+            <w:r/>
+            <w:r>
+              <w:rPr>
+                <w:rFonts w:ascii="Calibri" w:hAnsi="Calibri" w:eastAsia="Calibri"/>
+                <w:b w:val="0"/>
+                <w:color w:val="3D4A57"/>
+                <w:sz w:val="16"/>
+              </w:rPr>
+              <w:t>68</w:t>
+            </w:r>
+          </w:p>
+        </w:tc>
+        <w:tc>
+          <w:tcPr>
+            <w:tcW w:type="dxa" w:w="1134"/>
+            <w:shd w:fill="FFFFFF" w:val="clear"/>
+            <w:tcBorders>
+              <w:top w:val="single" w:sz="4" w:space="0" w:color="C5CDD6"/>
+              <w:left w:val="single" w:sz="4" w:space="0" w:color="C5CDD6"/>
+              <w:bottom w:val="single" w:sz="4" w:space="0" w:color="C5CDD6"/>
+              <w:right w:val="single" w:sz="4" w:space="0" w:color="C5CDD6"/>
+            </w:tcBorders>
+          </w:tcPr>
+          <w:p>
+            <w:pPr>
+              <w:spacing w:before="20" w:after="20"/>
+              <w:jc w:val="center"/>
+            </w:pPr>
+            <w:r/>
+            <w:r>
+              <w:rPr>
+                <w:rFonts w:ascii="Calibri" w:hAnsi="Calibri" w:eastAsia="Calibri"/>
+                <w:b w:val="0"/>
+                <w:color w:val="3D4A57"/>
+                <w:sz w:val="16"/>
+              </w:rPr>
+              <w:t>28</w:t>
+            </w:r>
+          </w:p>
+        </w:tc>
+        <w:tc>
+          <w:tcPr>
+            <w:tcW w:type="dxa" w:w="1247"/>
+            <w:shd w:fill="FFFFFF" w:val="clear"/>
+            <w:tcBorders>
+              <w:top w:val="single" w:sz="4" w:space="0" w:color="C5CDD6"/>
+              <w:left w:val="single" w:sz="4" w:space="0" w:color="C5CDD6"/>
+              <w:bottom w:val="single" w:sz="4" w:space="0" w:color="C5CDD6"/>
+              <w:right w:val="single" w:sz="4" w:space="0" w:color="C5CDD6"/>
+            </w:tcBorders>
+          </w:tcPr>
+          <w:p>
+            <w:pPr>
+              <w:spacing w:before="20" w:after="20"/>
+              <w:jc w:val="center"/>
+            </w:pPr>
+            <w:r/>
+            <w:r>
+              <w:rPr>
+                <w:rFonts w:ascii="Calibri" w:hAnsi="Calibri" w:eastAsia="Calibri"/>
+                <w:b w:val="0"/>
+                <w:color w:val="3D4A57"/>
+                <w:sz w:val="16"/>
+              </w:rPr>
+              <w:t>86.47%</w:t>
+            </w:r>
+          </w:p>
+        </w:tc>
+        <w:tc>
+          <w:tcPr>
+            <w:tcW w:type="dxa" w:w="2721"/>
+            <w:shd w:fill="FFFFFF" w:val="clear"/>
+            <w:tcBorders>
+              <w:top w:val="single" w:sz="4" w:space="0" w:color="C5CDD6"/>
+              <w:left w:val="single" w:sz="4" w:space="0" w:color="C5CDD6"/>
+              <w:bottom w:val="single" w:sz="4" w:space="0" w:color="C5CDD6"/>
+              <w:right w:val="single" w:sz="4" w:space="0" w:color="C5CDD6"/>
+            </w:tcBorders>
+          </w:tcPr>
+          <w:p>
+            <w:pPr>
+              <w:spacing w:before="20" w:after="20"/>
+              <w:jc w:val="center"/>
+            </w:pPr>
+            <w:r/>
+            <w:r>
+              <w:rPr>
+                <w:rFonts w:ascii="Calibri" w:hAnsi="Calibri" w:eastAsia="Calibri"/>
+                <w:b w:val="0"/>
+                <w:color w:val="3D4A57"/>
+                <w:sz w:val="16"/>
+              </w:rPr>
+              <w:t>Usually right when found; many missing</w:t>
+            </w:r>
+          </w:p>
+        </w:tc>
+      </w:tr>
+      <w:tr>
+        <w:tc>
+          <w:tcPr>
+            <w:tcW w:type="dxa" w:w="1361"/>
+            <w:shd w:fill="F4F7FA" w:val="clear"/>
+            <w:tcBorders>
+              <w:top w:val="single" w:sz="4" w:space="0" w:color="C5CDD6"/>
+              <w:left w:val="single" w:sz="4" w:space="0" w:color="C5CDD6"/>
+              <w:bottom w:val="single" w:sz="4" w:space="0" w:color="C5CDD6"/>
+              <w:right w:val="single" w:sz="4" w:space="0" w:color="C5CDD6"/>
+            </w:tcBorders>
+          </w:tcPr>
+          <w:p>
+            <w:pPr>
+              <w:spacing w:before="20" w:after="20"/>
+              <w:jc w:val="left"/>
+            </w:pPr>
+            <w:r/>
+            <w:r>
+              <w:rPr>
+                <w:rFonts w:ascii="Calibri" w:hAnsi="Calibri" w:eastAsia="Calibri"/>
+                <w:b/>
+                <w:color w:val="1B365D"/>
+                <w:sz w:val="16"/>
+              </w:rPr>
+              <w:t>Ø16</w:t>
+            </w:r>
+          </w:p>
+        </w:tc>
+        <w:tc>
+          <w:tcPr>
+            <w:tcW w:type="dxa" w:w="1247"/>
+            <w:shd w:fill="F4F7FA" w:val="clear"/>
+            <w:tcBorders>
+              <w:top w:val="single" w:sz="4" w:space="0" w:color="C5CDD6"/>
+              <w:left w:val="single" w:sz="4" w:space="0" w:color="C5CDD6"/>
+              <w:bottom w:val="single" w:sz="4" w:space="0" w:color="C5CDD6"/>
+              <w:right w:val="single" w:sz="4" w:space="0" w:color="C5CDD6"/>
+            </w:tcBorders>
+          </w:tcPr>
+          <w:p>
+            <w:pPr>
+              <w:spacing w:before="20" w:after="20"/>
+              <w:jc w:val="center"/>
+            </w:pPr>
+            <w:r/>
+            <w:r>
+              <w:rPr>
+                <w:rFonts w:ascii="Calibri" w:hAnsi="Calibri" w:eastAsia="Calibri"/>
+                <w:b w:val="0"/>
+                <w:color w:val="3D4A57"/>
+                <w:sz w:val="16"/>
+              </w:rPr>
+              <w:t>588</w:t>
+            </w:r>
+          </w:p>
+        </w:tc>
+        <w:tc>
+          <w:tcPr>
+            <w:tcW w:type="dxa" w:w="1020"/>
+            <w:shd w:fill="F4F7FA" w:val="clear"/>
+            <w:tcBorders>
+              <w:top w:val="single" w:sz="4" w:space="0" w:color="C5CDD6"/>
+              <w:left w:val="single" w:sz="4" w:space="0" w:color="C5CDD6"/>
+              <w:bottom w:val="single" w:sz="4" w:space="0" w:color="C5CDD6"/>
+              <w:right w:val="single" w:sz="4" w:space="0" w:color="C5CDD6"/>
+            </w:tcBorders>
+          </w:tcPr>
+          <w:p>
+            <w:pPr>
+              <w:spacing w:before="20" w:after="20"/>
+              <w:jc w:val="center"/>
+            </w:pPr>
+            <w:r/>
+            <w:r>
+              <w:rPr>
+                <w:rFonts w:ascii="Calibri" w:hAnsi="Calibri" w:eastAsia="Calibri"/>
+                <w:b w:val="0"/>
+                <w:color w:val="3D4A57"/>
+                <w:sz w:val="16"/>
+              </w:rPr>
+              <w:t>372</w:t>
+            </w:r>
+          </w:p>
+        </w:tc>
+        <w:tc>
+          <w:tcPr>
+            <w:tcW w:type="dxa" w:w="907"/>
+            <w:shd w:fill="F4F7FA" w:val="clear"/>
+            <w:tcBorders>
+              <w:top w:val="single" w:sz="4" w:space="0" w:color="C5CDD6"/>
+              <w:left w:val="single" w:sz="4" w:space="0" w:color="C5CDD6"/>
+              <w:bottom w:val="single" w:sz="4" w:space="0" w:color="C5CDD6"/>
+              <w:right w:val="single" w:sz="4" w:space="0" w:color="C5CDD6"/>
+            </w:tcBorders>
+          </w:tcPr>
+          <w:p>
+            <w:pPr>
+              <w:spacing w:before="20" w:after="20"/>
+              <w:jc w:val="center"/>
+            </w:pPr>
+            <w:r/>
+            <w:r>
+              <w:rPr>
+                <w:rFonts w:ascii="Calibri" w:hAnsi="Calibri" w:eastAsia="Calibri"/>
+                <w:b w:val="0"/>
+                <w:color w:val="3D4A57"/>
+                <w:sz w:val="16"/>
+              </w:rPr>
+              <w:t>169</w:t>
+            </w:r>
+          </w:p>
+        </w:tc>
+        <w:tc>
+          <w:tcPr>
+            <w:tcW w:type="dxa" w:w="1134"/>
+            <w:shd w:fill="F4F7FA" w:val="clear"/>
+            <w:tcBorders>
+              <w:top w:val="single" w:sz="4" w:space="0" w:color="C5CDD6"/>
+              <w:left w:val="single" w:sz="4" w:space="0" w:color="C5CDD6"/>
+              <w:bottom w:val="single" w:sz="4" w:space="0" w:color="C5CDD6"/>
+              <w:right w:val="single" w:sz="4" w:space="0" w:color="C5CDD6"/>
+            </w:tcBorders>
+          </w:tcPr>
+          <w:p>
+            <w:pPr>
+              <w:spacing w:before="20" w:after="20"/>
+              <w:jc w:val="center"/>
+            </w:pPr>
+            <w:r/>
+            <w:r>
+              <w:rPr>
+                <w:rFonts w:ascii="Calibri" w:hAnsi="Calibri" w:eastAsia="Calibri"/>
+                <w:b w:val="0"/>
+                <w:color w:val="3D4A57"/>
+                <w:sz w:val="16"/>
+              </w:rPr>
+              <w:t>112</w:t>
+            </w:r>
+          </w:p>
+        </w:tc>
+        <w:tc>
+          <w:tcPr>
+            <w:tcW w:type="dxa" w:w="1247"/>
+            <w:shd w:fill="F4F7FA" w:val="clear"/>
+            <w:tcBorders>
+              <w:top w:val="single" w:sz="4" w:space="0" w:color="C5CDD6"/>
+              <w:left w:val="single" w:sz="4" w:space="0" w:color="C5CDD6"/>
+              <w:bottom w:val="single" w:sz="4" w:space="0" w:color="C5CDD6"/>
+              <w:right w:val="single" w:sz="4" w:space="0" w:color="C5CDD6"/>
+            </w:tcBorders>
+          </w:tcPr>
+          <w:p>
+            <w:pPr>
+              <w:spacing w:before="20" w:after="20"/>
+              <w:jc w:val="center"/>
+            </w:pPr>
+            <w:r/>
+            <w:r>
+              <w:rPr>
+                <w:rFonts w:ascii="Calibri" w:hAnsi="Calibri" w:eastAsia="Calibri"/>
+                <w:b w:val="0"/>
+                <w:color w:val="3D4A57"/>
+                <w:sz w:val="16"/>
+              </w:rPr>
+              <w:t>69.89%</w:t>
+            </w:r>
+          </w:p>
+        </w:tc>
+        <w:tc>
+          <w:tcPr>
+            <w:tcW w:type="dxa" w:w="2721"/>
+            <w:shd w:fill="F4F7FA" w:val="clear"/>
+            <w:tcBorders>
+              <w:top w:val="single" w:sz="4" w:space="0" w:color="C5CDD6"/>
+              <w:left w:val="single" w:sz="4" w:space="0" w:color="C5CDD6"/>
+              <w:bottom w:val="single" w:sz="4" w:space="0" w:color="C5CDD6"/>
+              <w:right w:val="single" w:sz="4" w:space="0" w:color="C5CDD6"/>
+            </w:tcBorders>
+          </w:tcPr>
+          <w:p>
+            <w:pPr>
+              <w:spacing w:before="20" w:after="20"/>
+              <w:jc w:val="center"/>
+            </w:pPr>
+            <w:r/>
+            <w:r>
+              <w:rPr>
+                <w:rFonts w:ascii="Calibri" w:hAnsi="Calibri" w:eastAsia="Calibri"/>
+                <w:b w:val="0"/>
+                <w:color w:val="3D4A57"/>
+                <w:sz w:val="16"/>
+              </w:rPr>
+              <w:t>Frequent diameter swaps</w:t>
+            </w:r>
+          </w:p>
+        </w:tc>
+      </w:tr>
+      <w:tr>
+        <w:tc>
+          <w:tcPr>
+            <w:tcW w:type="dxa" w:w="1361"/>
+            <w:shd w:fill="FFFFFF" w:val="clear"/>
+            <w:tcBorders>
+              <w:top w:val="single" w:sz="4" w:space="0" w:color="C5CDD6"/>
+              <w:left w:val="single" w:sz="4" w:space="0" w:color="C5CDD6"/>
+              <w:bottom w:val="single" w:sz="4" w:space="0" w:color="C5CDD6"/>
+              <w:right w:val="single" w:sz="4" w:space="0" w:color="C5CDD6"/>
+            </w:tcBorders>
+          </w:tcPr>
+          <w:p>
+            <w:pPr>
+              <w:spacing w:before="20" w:after="20"/>
+              <w:jc w:val="left"/>
+            </w:pPr>
+            <w:r/>
+            <w:r>
+              <w:rPr>
+                <w:rFonts w:ascii="Calibri" w:hAnsi="Calibri" w:eastAsia="Calibri"/>
+                <w:b/>
+                <w:color w:val="1B365D"/>
+                <w:sz w:val="16"/>
+              </w:rPr>
+              <w:t>Ø20</w:t>
+            </w:r>
+          </w:p>
+        </w:tc>
+        <w:tc>
+          <w:tcPr>
+            <w:tcW w:type="dxa" w:w="1247"/>
+            <w:shd w:fill="FFFFFF" w:val="clear"/>
+            <w:tcBorders>
+              <w:top w:val="single" w:sz="4" w:space="0" w:color="C5CDD6"/>
+              <w:left w:val="single" w:sz="4" w:space="0" w:color="C5CDD6"/>
+              <w:bottom w:val="single" w:sz="4" w:space="0" w:color="C5CDD6"/>
+              <w:right w:val="single" w:sz="4" w:space="0" w:color="C5CDD6"/>
+            </w:tcBorders>
+          </w:tcPr>
+          <w:p>
+            <w:pPr>
+              <w:spacing w:before="20" w:after="20"/>
+              <w:jc w:val="center"/>
+            </w:pPr>
+            <w:r/>
+            <w:r>
+              <w:rPr>
+                <w:rFonts w:ascii="Calibri" w:hAnsi="Calibri" w:eastAsia="Calibri"/>
+                <w:b w:val="0"/>
+                <w:color w:val="3D4A57"/>
+                <w:sz w:val="16"/>
+              </w:rPr>
+              <w:t>784</w:t>
+            </w:r>
+          </w:p>
+        </w:tc>
+        <w:tc>
+          <w:tcPr>
+            <w:tcW w:type="dxa" w:w="1020"/>
+            <w:shd w:fill="FFFFFF" w:val="clear"/>
+            <w:tcBorders>
+              <w:top w:val="single" w:sz="4" w:space="0" w:color="C5CDD6"/>
+              <w:left w:val="single" w:sz="4" w:space="0" w:color="C5CDD6"/>
+              <w:bottom w:val="single" w:sz="4" w:space="0" w:color="C5CDD6"/>
+              <w:right w:val="single" w:sz="4" w:space="0" w:color="C5CDD6"/>
+            </w:tcBorders>
+          </w:tcPr>
+          <w:p>
+            <w:pPr>
+              <w:spacing w:before="20" w:after="20"/>
+              <w:jc w:val="center"/>
+            </w:pPr>
+            <w:r/>
+            <w:r>
+              <w:rPr>
+                <w:rFonts w:ascii="Calibri" w:hAnsi="Calibri" w:eastAsia="Calibri"/>
+                <w:b w:val="0"/>
+                <w:color w:val="3D4A57"/>
+                <w:sz w:val="16"/>
+              </w:rPr>
+              <w:t>436</w:t>
+            </w:r>
+          </w:p>
+        </w:tc>
+        <w:tc>
+          <w:tcPr>
+            <w:tcW w:type="dxa" w:w="907"/>
+            <w:shd w:fill="FFFFFF" w:val="clear"/>
+            <w:tcBorders>
+              <w:top w:val="single" w:sz="4" w:space="0" w:color="C5CDD6"/>
+              <w:left w:val="single" w:sz="4" w:space="0" w:color="C5CDD6"/>
+              <w:bottom w:val="single" w:sz="4" w:space="0" w:color="C5CDD6"/>
+              <w:right w:val="single" w:sz="4" w:space="0" w:color="C5CDD6"/>
+            </w:tcBorders>
+          </w:tcPr>
+          <w:p>
+            <w:pPr>
+              <w:spacing w:before="20" w:after="20"/>
+              <w:jc w:val="center"/>
+            </w:pPr>
+            <w:r/>
+            <w:r>
+              <w:rPr>
+                <w:rFonts w:ascii="Calibri" w:hAnsi="Calibri" w:eastAsia="Calibri"/>
+                <w:b w:val="0"/>
+                <w:color w:val="3D4A57"/>
+                <w:sz w:val="16"/>
+              </w:rPr>
+              <w:t>193</w:t>
+            </w:r>
+          </w:p>
+        </w:tc>
+        <w:tc>
+          <w:tcPr>
+            <w:tcW w:type="dxa" w:w="1134"/>
+            <w:shd w:fill="FFFFFF" w:val="clear"/>
+            <w:tcBorders>
+              <w:top w:val="single" w:sz="4" w:space="0" w:color="C5CDD6"/>
+              <w:left w:val="single" w:sz="4" w:space="0" w:color="C5CDD6"/>
+              <w:bottom w:val="single" w:sz="4" w:space="0" w:color="C5CDD6"/>
+              <w:right w:val="single" w:sz="4" w:space="0" w:color="C5CDD6"/>
+            </w:tcBorders>
+          </w:tcPr>
+          <w:p>
+            <w:pPr>
+              <w:spacing w:before="20" w:after="20"/>
+              <w:jc w:val="center"/>
+            </w:pPr>
+            <w:r/>
+            <w:r>
+              <w:rPr>
+                <w:rFonts w:ascii="Calibri" w:hAnsi="Calibri" w:eastAsia="Calibri"/>
+                <w:b w:val="0"/>
+                <w:color w:val="3D4A57"/>
+                <w:sz w:val="16"/>
+              </w:rPr>
+              <w:t>155</w:t>
+            </w:r>
+          </w:p>
+        </w:tc>
+        <w:tc>
+          <w:tcPr>
+            <w:tcW w:type="dxa" w:w="1247"/>
+            <w:shd w:fill="FFFFFF" w:val="clear"/>
+            <w:tcBorders>
+              <w:top w:val="single" w:sz="4" w:space="0" w:color="C5CDD6"/>
+              <w:left w:val="single" w:sz="4" w:space="0" w:color="C5CDD6"/>
+              <w:bottom w:val="single" w:sz="4" w:space="0" w:color="C5CDD6"/>
+              <w:right w:val="single" w:sz="4" w:space="0" w:color="C5CDD6"/>
+            </w:tcBorders>
+          </w:tcPr>
+          <w:p>
+            <w:pPr>
+              <w:spacing w:before="20" w:after="20"/>
+              <w:jc w:val="center"/>
+            </w:pPr>
+            <w:r/>
+            <w:r>
+              <w:rPr>
+                <w:rFonts w:ascii="Calibri" w:hAnsi="Calibri" w:eastAsia="Calibri"/>
+                <w:b w:val="0"/>
+                <w:color w:val="3D4A57"/>
+                <w:sz w:val="16"/>
+              </w:rPr>
+              <w:t>64.45%</w:t>
+            </w:r>
+          </w:p>
+        </w:tc>
+        <w:tc>
+          <w:tcPr>
+            <w:tcW w:type="dxa" w:w="2721"/>
+            <w:shd w:fill="FFFFFF" w:val="clear"/>
+            <w:tcBorders>
+              <w:top w:val="single" w:sz="4" w:space="0" w:color="C5CDD6"/>
+              <w:left w:val="single" w:sz="4" w:space="0" w:color="C5CDD6"/>
+              <w:bottom w:val="single" w:sz="4" w:space="0" w:color="C5CDD6"/>
+              <w:right w:val="single" w:sz="4" w:space="0" w:color="C5CDD6"/>
+            </w:tcBorders>
+          </w:tcPr>
+          <w:p>
+            <w:pPr>
+              <w:spacing w:before="20" w:after="20"/>
+              <w:jc w:val="center"/>
+            </w:pPr>
+            <w:r/>
+            <w:r>
+              <w:rPr>
+                <w:rFonts w:ascii="Calibri" w:hAnsi="Calibri" w:eastAsia="Calibri"/>
+                <w:b w:val="0"/>
+                <w:color w:val="3D4A57"/>
+                <w:sz w:val="16"/>
+              </w:rPr>
+              <w:t>Frequent diameter swaps</w:t>
+            </w:r>
+          </w:p>
+        </w:tc>
+      </w:tr>
+      <w:tr>
+        <w:tc>
+          <w:tcPr>
+            <w:tcW w:type="dxa" w:w="1361"/>
+            <w:shd w:fill="F4F7FA" w:val="clear"/>
+            <w:tcBorders>
+              <w:top w:val="single" w:sz="4" w:space="0" w:color="C5CDD6"/>
+              <w:left w:val="single" w:sz="4" w:space="0" w:color="C5CDD6"/>
+              <w:bottom w:val="single" w:sz="4" w:space="0" w:color="C5CDD6"/>
+              <w:right w:val="single" w:sz="4" w:space="0" w:color="C5CDD6"/>
+            </w:tcBorders>
+          </w:tcPr>
+          <w:p>
+            <w:pPr>
+              <w:spacing w:before="20" w:after="20"/>
+              <w:jc w:val="left"/>
+            </w:pPr>
+            <w:r/>
+            <w:r>
+              <w:rPr>
+                <w:rFonts w:ascii="Calibri" w:hAnsi="Calibri" w:eastAsia="Calibri"/>
+                <w:b/>
+                <w:color w:val="1B365D"/>
+                <w:sz w:val="16"/>
+              </w:rPr>
+              <w:t>Ø25</w:t>
+            </w:r>
+          </w:p>
+        </w:tc>
+        <w:tc>
+          <w:tcPr>
+            <w:tcW w:type="dxa" w:w="1247"/>
+            <w:shd w:fill="F4F7FA" w:val="clear"/>
+            <w:tcBorders>
+              <w:top w:val="single" w:sz="4" w:space="0" w:color="C5CDD6"/>
+              <w:left w:val="single" w:sz="4" w:space="0" w:color="C5CDD6"/>
+              <w:bottom w:val="single" w:sz="4" w:space="0" w:color="C5CDD6"/>
+              <w:right w:val="single" w:sz="4" w:space="0" w:color="C5CDD6"/>
+            </w:tcBorders>
+          </w:tcPr>
+          <w:p>
+            <w:pPr>
+              <w:spacing w:before="20" w:after="20"/>
+              <w:jc w:val="center"/>
+            </w:pPr>
+            <w:r/>
+            <w:r>
+              <w:rPr>
+                <w:rFonts w:ascii="Calibri" w:hAnsi="Calibri" w:eastAsia="Calibri"/>
+                <w:b w:val="0"/>
+                <w:color w:val="3D4A57"/>
+                <w:sz w:val="16"/>
+              </w:rPr>
+              <w:t>1,097</w:t>
+            </w:r>
+          </w:p>
+        </w:tc>
+        <w:tc>
+          <w:tcPr>
+            <w:tcW w:type="dxa" w:w="1020"/>
+            <w:shd w:fill="F4F7FA" w:val="clear"/>
+            <w:tcBorders>
+              <w:top w:val="single" w:sz="4" w:space="0" w:color="C5CDD6"/>
+              <w:left w:val="single" w:sz="4" w:space="0" w:color="C5CDD6"/>
+              <w:bottom w:val="single" w:sz="4" w:space="0" w:color="C5CDD6"/>
+              <w:right w:val="single" w:sz="4" w:space="0" w:color="C5CDD6"/>
+            </w:tcBorders>
+          </w:tcPr>
+          <w:p>
+            <w:pPr>
+              <w:spacing w:before="20" w:after="20"/>
+              <w:jc w:val="center"/>
+            </w:pPr>
+            <w:r/>
+            <w:r>
+              <w:rPr>
+                <w:rFonts w:ascii="Calibri" w:hAnsi="Calibri" w:eastAsia="Calibri"/>
+                <w:b w:val="0"/>
+                <w:color w:val="3D4A57"/>
+                <w:sz w:val="16"/>
+              </w:rPr>
+              <w:t>616</w:t>
+            </w:r>
+          </w:p>
+        </w:tc>
+        <w:tc>
+          <w:tcPr>
+            <w:tcW w:type="dxa" w:w="907"/>
+            <w:shd w:fill="F4F7FA" w:val="clear"/>
+            <w:tcBorders>
+              <w:top w:val="single" w:sz="4" w:space="0" w:color="C5CDD6"/>
+              <w:left w:val="single" w:sz="4" w:space="0" w:color="C5CDD6"/>
+              <w:bottom w:val="single" w:sz="4" w:space="0" w:color="C5CDD6"/>
+              <w:right w:val="single" w:sz="4" w:space="0" w:color="C5CDD6"/>
+            </w:tcBorders>
+          </w:tcPr>
+          <w:p>
+            <w:pPr>
+              <w:spacing w:before="20" w:after="20"/>
+              <w:jc w:val="center"/>
+            </w:pPr>
+            <w:r/>
+            <w:r>
+              <w:rPr>
+                <w:rFonts w:ascii="Calibri" w:hAnsi="Calibri" w:eastAsia="Calibri"/>
+                <w:b w:val="0"/>
+                <w:color w:val="3D4A57"/>
+                <w:sz w:val="16"/>
+              </w:rPr>
+              <w:t>210</w:t>
+            </w:r>
+          </w:p>
+        </w:tc>
+        <w:tc>
+          <w:tcPr>
+            <w:tcW w:type="dxa" w:w="1134"/>
+            <w:shd w:fill="F4F7FA" w:val="clear"/>
+            <w:tcBorders>
+              <w:top w:val="single" w:sz="4" w:space="0" w:color="C5CDD6"/>
+              <w:left w:val="single" w:sz="4" w:space="0" w:color="C5CDD6"/>
+              <w:bottom w:val="single" w:sz="4" w:space="0" w:color="C5CDD6"/>
+              <w:right w:val="single" w:sz="4" w:space="0" w:color="C5CDD6"/>
+            </w:tcBorders>
+          </w:tcPr>
+          <w:p>
+            <w:pPr>
+              <w:spacing w:before="20" w:after="20"/>
+              <w:jc w:val="center"/>
+            </w:pPr>
+            <w:r/>
+            <w:r>
+              <w:rPr>
+                <w:rFonts w:ascii="Calibri" w:hAnsi="Calibri" w:eastAsia="Calibri"/>
+                <w:b w:val="0"/>
+                <w:color w:val="3D4A57"/>
+                <w:sz w:val="16"/>
+              </w:rPr>
+              <w:t>130</w:t>
+            </w:r>
+          </w:p>
+        </w:tc>
+        <w:tc>
+          <w:tcPr>
+            <w:tcW w:type="dxa" w:w="1247"/>
+            <w:shd w:fill="F4F7FA" w:val="clear"/>
+            <w:tcBorders>
+              <w:top w:val="single" w:sz="4" w:space="0" w:color="C5CDD6"/>
+              <w:left w:val="single" w:sz="4" w:space="0" w:color="C5CDD6"/>
+              <w:bottom w:val="single" w:sz="4" w:space="0" w:color="C5CDD6"/>
+              <w:right w:val="single" w:sz="4" w:space="0" w:color="C5CDD6"/>
+            </w:tcBorders>
+          </w:tcPr>
+          <w:p>
+            <w:pPr>
+              <w:spacing w:before="20" w:after="20"/>
+              <w:jc w:val="center"/>
+            </w:pPr>
+            <w:r/>
+            <w:r>
+              <w:rPr>
+                <w:rFonts w:ascii="Calibri" w:hAnsi="Calibri" w:eastAsia="Calibri"/>
+                <w:b w:val="0"/>
+                <w:color w:val="3D4A57"/>
+                <w:sz w:val="16"/>
+              </w:rPr>
+              <w:t>78.90%</w:t>
+            </w:r>
+          </w:p>
+        </w:tc>
+        <w:tc>
+          <w:tcPr>
+            <w:tcW w:type="dxa" w:w="2721"/>
+            <w:shd w:fill="F4F7FA" w:val="clear"/>
+            <w:tcBorders>
+              <w:top w:val="single" w:sz="4" w:space="0" w:color="C5CDD6"/>
+              <w:left w:val="single" w:sz="4" w:space="0" w:color="C5CDD6"/>
+              <w:bottom w:val="single" w:sz="4" w:space="0" w:color="C5CDD6"/>
+              <w:right w:val="single" w:sz="4" w:space="0" w:color="C5CDD6"/>
+            </w:tcBorders>
+          </w:tcPr>
+          <w:p>
+            <w:pPr>
+              <w:spacing w:before="20" w:after="20"/>
+              <w:jc w:val="center"/>
+            </w:pPr>
+            <w:r/>
+            <w:r>
+              <w:rPr>
+                <w:rFonts w:ascii="Calibri" w:hAnsi="Calibri" w:eastAsia="Calibri"/>
+                <w:b w:val="0"/>
+                <w:color w:val="3D4A57"/>
+                <w:sz w:val="16"/>
+              </w:rPr>
+            </w:r>
+          </w:p>
+        </w:tc>
+      </w:tr>
+      <w:tr>
+        <w:tc>
+          <w:tcPr>
+            <w:tcW w:type="dxa" w:w="1361"/>
+            <w:shd w:fill="FFFFFF" w:val="clear"/>
+            <w:tcBorders>
+              <w:top w:val="single" w:sz="4" w:space="0" w:color="C5CDD6"/>
+              <w:left w:val="single" w:sz="4" w:space="0" w:color="C5CDD6"/>
+              <w:bottom w:val="single" w:sz="4" w:space="0" w:color="C5CDD6"/>
+              <w:right w:val="single" w:sz="4" w:space="0" w:color="C5CDD6"/>
+            </w:tcBorders>
+          </w:tcPr>
+          <w:p>
+            <w:pPr>
+              <w:spacing w:before="20" w:after="20"/>
+              <w:jc w:val="left"/>
+            </w:pPr>
+            <w:r/>
+            <w:r>
+              <w:rPr>
+                <w:rFonts w:ascii="Calibri" w:hAnsi="Calibri" w:eastAsia="Calibri"/>
+                <w:b/>
+                <w:color w:val="1B365D"/>
+                <w:sz w:val="16"/>
+              </w:rPr>
+              <w:t>Ø32</w:t>
+            </w:r>
+          </w:p>
+        </w:tc>
+        <w:tc>
+          <w:tcPr>
+            <w:tcW w:type="dxa" w:w="1247"/>
+            <w:shd w:fill="FFFFFF" w:val="clear"/>
+            <w:tcBorders>
+              <w:top w:val="single" w:sz="4" w:space="0" w:color="C5CDD6"/>
+              <w:left w:val="single" w:sz="4" w:space="0" w:color="C5CDD6"/>
+              <w:bottom w:val="single" w:sz="4" w:space="0" w:color="C5CDD6"/>
+              <w:right w:val="single" w:sz="4" w:space="0" w:color="C5CDD6"/>
+            </w:tcBorders>
+          </w:tcPr>
+          <w:p>
+            <w:pPr>
+              <w:spacing w:before="20" w:after="20"/>
+              <w:jc w:val="center"/>
+            </w:pPr>
+            <w:r/>
+            <w:r>
+              <w:rPr>
+                <w:rFonts w:ascii="Calibri" w:hAnsi="Calibri" w:eastAsia="Calibri"/>
+                <w:b w:val="0"/>
+                <w:color w:val="3D4A57"/>
+                <w:sz w:val="16"/>
+              </w:rPr>
+              <w:t>26</w:t>
+            </w:r>
+          </w:p>
+        </w:tc>
+        <w:tc>
+          <w:tcPr>
+            <w:tcW w:type="dxa" w:w="1020"/>
+            <w:shd w:fill="FFFFFF" w:val="clear"/>
+            <w:tcBorders>
+              <w:top w:val="single" w:sz="4" w:space="0" w:color="C5CDD6"/>
+              <w:left w:val="single" w:sz="4" w:space="0" w:color="C5CDD6"/>
+              <w:bottom w:val="single" w:sz="4" w:space="0" w:color="C5CDD6"/>
+              <w:right w:val="single" w:sz="4" w:space="0" w:color="C5CDD6"/>
+            </w:tcBorders>
+          </w:tcPr>
+          <w:p>
+            <w:pPr>
+              <w:spacing w:before="20" w:after="20"/>
+              <w:jc w:val="center"/>
+            </w:pPr>
+            <w:r/>
+            <w:r>
+              <w:rPr>
+                <w:rFonts w:ascii="Calibri" w:hAnsi="Calibri" w:eastAsia="Calibri"/>
+                <w:b w:val="0"/>
+                <w:color w:val="3D4A57"/>
+                <w:sz w:val="16"/>
+              </w:rPr>
+              <w:t>11</w:t>
+            </w:r>
+          </w:p>
+        </w:tc>
+        <w:tc>
+          <w:tcPr>
+            <w:tcW w:type="dxa" w:w="907"/>
+            <w:shd w:fill="FFFFFF" w:val="clear"/>
+            <w:tcBorders>
+              <w:top w:val="single" w:sz="4" w:space="0" w:color="C5CDD6"/>
+              <w:left w:val="single" w:sz="4" w:space="0" w:color="C5CDD6"/>
+              <w:bottom w:val="single" w:sz="4" w:space="0" w:color="C5CDD6"/>
+              <w:right w:val="single" w:sz="4" w:space="0" w:color="C5CDD6"/>
+            </w:tcBorders>
+          </w:tcPr>
+          <w:p>
+            <w:pPr>
+              <w:spacing w:before="20" w:after="20"/>
+              <w:jc w:val="center"/>
+            </w:pPr>
+            <w:r/>
+            <w:r>
+              <w:rPr>
+                <w:rFonts w:ascii="Calibri" w:hAnsi="Calibri" w:eastAsia="Calibri"/>
+                <w:b w:val="0"/>
+                <w:color w:val="3D4A57"/>
+                <w:sz w:val="16"/>
+              </w:rPr>
+              <w:t>5</w:t>
+            </w:r>
+          </w:p>
+        </w:tc>
+        <w:tc>
+          <w:tcPr>
+            <w:tcW w:type="dxa" w:w="1134"/>
+            <w:shd w:fill="FFFFFF" w:val="clear"/>
+            <w:tcBorders>
+              <w:top w:val="single" w:sz="4" w:space="0" w:color="C5CDD6"/>
+              <w:left w:val="single" w:sz="4" w:space="0" w:color="C5CDD6"/>
+              <w:bottom w:val="single" w:sz="4" w:space="0" w:color="C5CDD6"/>
+              <w:right w:val="single" w:sz="4" w:space="0" w:color="C5CDD6"/>
+            </w:tcBorders>
+          </w:tcPr>
+          <w:p>
+            <w:pPr>
+              <w:spacing w:before="20" w:after="20"/>
+              <w:jc w:val="center"/>
+            </w:pPr>
+            <w:r/>
+            <w:r>
+              <w:rPr>
+                <w:rFonts w:ascii="Calibri" w:hAnsi="Calibri" w:eastAsia="Calibri"/>
+                <w:b w:val="0"/>
+                <w:color w:val="3D4A57"/>
+                <w:sz w:val="16"/>
+              </w:rPr>
+              <w:t>6</w:t>
+            </w:r>
+          </w:p>
+        </w:tc>
+        <w:tc>
+          <w:tcPr>
+            <w:tcW w:type="dxa" w:w="1247"/>
+            <w:shd w:fill="FFFFFF" w:val="clear"/>
+            <w:tcBorders>
+              <w:top w:val="single" w:sz="4" w:space="0" w:color="C5CDD6"/>
+              <w:left w:val="single" w:sz="4" w:space="0" w:color="C5CDD6"/>
+              <w:bottom w:val="single" w:sz="4" w:space="0" w:color="C5CDD6"/>
+              <w:right w:val="single" w:sz="4" w:space="0" w:color="C5CDD6"/>
+            </w:tcBorders>
+          </w:tcPr>
+          <w:p>
+            <w:pPr>
+              <w:spacing w:before="20" w:after="20"/>
+              <w:jc w:val="center"/>
+            </w:pPr>
+            <w:r/>
+            <w:r>
+              <w:rPr>
+                <w:rFonts w:ascii="Calibri" w:hAnsi="Calibri" w:eastAsia="Calibri"/>
+                <w:b w:val="0"/>
+                <w:color w:val="3D4A57"/>
+                <w:sz w:val="16"/>
+              </w:rPr>
+              <w:t>45.45%</w:t>
+            </w:r>
+          </w:p>
+        </w:tc>
+        <w:tc>
+          <w:tcPr>
+            <w:tcW w:type="dxa" w:w="2721"/>
+            <w:shd w:fill="FFFFFF" w:val="clear"/>
+            <w:tcBorders>
+              <w:top w:val="single" w:sz="4" w:space="0" w:color="C5CDD6"/>
+              <w:left w:val="single" w:sz="4" w:space="0" w:color="C5CDD6"/>
+              <w:bottom w:val="single" w:sz="4" w:space="0" w:color="C5CDD6"/>
+              <w:right w:val="single" w:sz="4" w:space="0" w:color="C5CDD6"/>
+            </w:tcBorders>
+          </w:tcPr>
+          <w:p>
+            <w:pPr>
+              <w:spacing w:before="20" w:after="20"/>
+              <w:jc w:val="center"/>
+            </w:pPr>
+            <w:r/>
+            <w:r>
+              <w:rPr>
+                <w:rFonts w:ascii="Calibri" w:hAnsi="Calibri" w:eastAsia="Calibri"/>
+                <w:b w:val="0"/>
+                <w:color w:val="3D4A57"/>
+                <w:sz w:val="16"/>
+              </w:rPr>
+              <w:t>Low volume - percentage unstable</w:t>
+            </w:r>
+          </w:p>
+        </w:tc>
+      </w:tr>
+      <w:tr>
+        <w:tc>
+          <w:tcPr>
+            <w:tcW w:type="dxa" w:w="1361"/>
+            <w:shd w:fill="E8EEF4" w:val="clear"/>
+            <w:tcBorders>
+              <w:top w:val="single" w:sz="4" w:space="0" w:color="C5CDD6"/>
+              <w:left w:val="single" w:sz="4" w:space="0" w:color="C5CDD6"/>
+              <w:bottom w:val="single" w:sz="4" w:space="0" w:color="C5CDD6"/>
+              <w:right w:val="single" w:sz="4" w:space="0" w:color="C5CDD6"/>
+            </w:tcBorders>
+          </w:tcPr>
+          <w:p>
+            <w:pPr>
+              <w:spacing w:before="20" w:after="20"/>
+              <w:jc w:val="left"/>
+            </w:pPr>
+            <w:r/>
+            <w:r>
+              <w:rPr>
+                <w:rFonts w:ascii="Calibri" w:hAnsi="Calibri" w:eastAsia="Calibri"/>
+                <w:b/>
+                <w:color w:val="1B365D"/>
+                <w:sz w:val="16"/>
+              </w:rPr>
+              <w:t>TOTAL scored Ø8-Ø32</w:t>
+            </w:r>
+          </w:p>
+        </w:tc>
+        <w:tc>
+          <w:tcPr>
+            <w:tcW w:type="dxa" w:w="1247"/>
+            <w:shd w:fill="E8EEF4" w:val="clear"/>
+            <w:tcBorders>
+              <w:top w:val="single" w:sz="4" w:space="0" w:color="C5CDD6"/>
+              <w:left w:val="single" w:sz="4" w:space="0" w:color="C5CDD6"/>
+              <w:bottom w:val="single" w:sz="4" w:space="0" w:color="C5CDD6"/>
+              <w:right w:val="single" w:sz="4" w:space="0" w:color="C5CDD6"/>
+            </w:tcBorders>
+          </w:tcPr>
+          <w:p>
+            <w:pPr>
+              <w:spacing w:before="20" w:after="20"/>
+              <w:jc w:val="center"/>
+            </w:pPr>
+            <w:r/>
+            <w:r>
+              <w:rPr>
+                <w:rFonts w:ascii="Calibri" w:hAnsi="Calibri" w:eastAsia="Calibri"/>
+                <w:b/>
+                <w:color w:val="3D4A57"/>
+                <w:sz w:val="16"/>
+              </w:rPr>
+              <w:t>4,140</w:t>
+            </w:r>
+          </w:p>
+        </w:tc>
+        <w:tc>
+          <w:tcPr>
+            <w:tcW w:type="dxa" w:w="1020"/>
+            <w:shd w:fill="E8EEF4" w:val="clear"/>
+            <w:tcBorders>
+              <w:top w:val="single" w:sz="4" w:space="0" w:color="C5CDD6"/>
+              <w:left w:val="single" w:sz="4" w:space="0" w:color="C5CDD6"/>
+              <w:bottom w:val="single" w:sz="4" w:space="0" w:color="C5CDD6"/>
+              <w:right w:val="single" w:sz="4" w:space="0" w:color="C5CDD6"/>
+            </w:tcBorders>
+          </w:tcPr>
+          <w:p>
+            <w:pPr>
+              <w:spacing w:before="20" w:after="20"/>
+              <w:jc w:val="center"/>
+            </w:pPr>
+            <w:r/>
+            <w:r>
+              <w:rPr>
+                <w:rFonts w:ascii="Calibri" w:hAnsi="Calibri" w:eastAsia="Calibri"/>
+                <w:b/>
+                <w:color w:val="3D4A57"/>
+                <w:sz w:val="16"/>
+              </w:rPr>
+              <w:t>2,008</w:t>
+            </w:r>
+          </w:p>
+        </w:tc>
+        <w:tc>
+          <w:tcPr>
+            <w:tcW w:type="dxa" w:w="907"/>
+            <w:shd w:fill="E8EEF4" w:val="clear"/>
+            <w:tcBorders>
+              <w:top w:val="single" w:sz="4" w:space="0" w:color="C5CDD6"/>
+              <w:left w:val="single" w:sz="4" w:space="0" w:color="C5CDD6"/>
+              <w:bottom w:val="single" w:sz="4" w:space="0" w:color="C5CDD6"/>
+              <w:right w:val="single" w:sz="4" w:space="0" w:color="C5CDD6"/>
+            </w:tcBorders>
+          </w:tcPr>
+          <w:p>
+            <w:pPr>
+              <w:spacing w:before="20" w:after="20"/>
+              <w:jc w:val="center"/>
+            </w:pPr>
+            <w:r/>
+            <w:r>
+              <w:rPr>
+                <w:rFonts w:ascii="Calibri" w:hAnsi="Calibri" w:eastAsia="Calibri"/>
+                <w:b/>
+                <w:color w:val="3D4A57"/>
+                <w:sz w:val="16"/>
+              </w:rPr>
+              <w:t>733</w:t>
+            </w:r>
+          </w:p>
+        </w:tc>
+        <w:tc>
+          <w:tcPr>
+            <w:tcW w:type="dxa" w:w="1134"/>
+            <w:shd w:fill="E8EEF4" w:val="clear"/>
+            <w:tcBorders>
+              <w:top w:val="single" w:sz="4" w:space="0" w:color="C5CDD6"/>
+              <w:left w:val="single" w:sz="4" w:space="0" w:color="C5CDD6"/>
+              <w:bottom w:val="single" w:sz="4" w:space="0" w:color="C5CDD6"/>
+              <w:right w:val="single" w:sz="4" w:space="0" w:color="C5CDD6"/>
+            </w:tcBorders>
+          </w:tcPr>
+          <w:p>
+            <w:pPr>
+              <w:spacing w:before="20" w:after="20"/>
+              <w:jc w:val="center"/>
+            </w:pPr>
+            <w:r/>
+            <w:r>
+              <w:rPr>
+                <w:rFonts w:ascii="Calibri" w:hAnsi="Calibri" w:eastAsia="Calibri"/>
+                <w:b/>
+                <w:color w:val="3D4A57"/>
+                <w:sz w:val="16"/>
+              </w:rPr>
+              <w:t>445</w:t>
+            </w:r>
+          </w:p>
+        </w:tc>
+        <w:tc>
+          <w:tcPr>
+            <w:tcW w:type="dxa" w:w="1247"/>
+            <w:shd w:fill="E8EEF4" w:val="clear"/>
+            <w:tcBorders>
+              <w:top w:val="single" w:sz="4" w:space="0" w:color="C5CDD6"/>
+              <w:left w:val="single" w:sz="4" w:space="0" w:color="C5CDD6"/>
+              <w:bottom w:val="single" w:sz="4" w:space="0" w:color="C5CDD6"/>
+              <w:right w:val="single" w:sz="4" w:space="0" w:color="C5CDD6"/>
+            </w:tcBorders>
+          </w:tcPr>
+          <w:p>
+            <w:pPr>
+              <w:spacing w:before="20" w:after="20"/>
+              <w:jc w:val="center"/>
+            </w:pPr>
+            <w:r/>
+            <w:r>
+              <w:rPr>
+                <w:rFonts w:ascii="Calibri" w:hAnsi="Calibri" w:eastAsia="Calibri"/>
+                <w:b/>
+                <w:color w:val="3D4A57"/>
+                <w:sz w:val="16"/>
+              </w:rPr>
+              <w:t>77.84%</w:t>
+            </w:r>
+          </w:p>
+        </w:tc>
+        <w:tc>
+          <w:tcPr>
+            <w:tcW w:type="dxa" w:w="2721"/>
+            <w:shd w:fill="E8EEF4" w:val="clear"/>
+            <w:tcBorders>
+              <w:top w:val="single" w:sz="4" w:space="0" w:color="C5CDD6"/>
+              <w:left w:val="single" w:sz="4" w:space="0" w:color="C5CDD6"/>
+              <w:bottom w:val="single" w:sz="4" w:space="0" w:color="C5CDD6"/>
+              <w:right w:val="single" w:sz="4" w:space="0" w:color="C5CDD6"/>
+            </w:tcBorders>
+          </w:tcPr>
+          <w:p>
+            <w:pPr>
+              <w:spacing w:before="20" w:after="20"/>
+              <w:jc w:val="center"/>
+            </w:pPr>
+            <w:r/>
+            <w:r>
+              <w:rPr>
+                <w:rFonts w:ascii="Calibri" w:hAnsi="Calibri" w:eastAsia="Calibri"/>
+                <w:b/>
+                <w:color w:val="3D4A57"/>
+                <w:sz w:val="16"/>
+              </w:rPr>
+              <w:t>Pooled headline from raw counts</w:t>
+            </w:r>
+          </w:p>
+        </w:tc>
+      </w:tr>
+    </w:tbl>
+    <w:p>
+      <w:pPr>
+        <w:spacing w:after="120"/>
+      </w:pPr>
+    </w:p>
+    <w:tbl>
+      <w:tblPr>
+        <w:tblW w:type="dxa" w:w="9639"/>
+        <w:jc w:val="center"/>
+        <w:tblLayout w:type="fixed"/>
+        <w:tblLook w:firstColumn="1" w:firstRow="1" w:lastColumn="0" w:lastRow="0" w:noHBand="0" w:noVBand="1" w:val="04A0"/>
+      </w:tblPr>
+      <w:tblGrid>
+        <w:gridCol w:w="9978"/>
+      </w:tblGrid>
+      <w:tr>
+        <w:tc>
+          <w:tcPr>
+            <w:tcW w:type="dxa" w:w="9638"/>
+            <w:shd w:fill="1B365D" w:val="clear"/>
+            <w:tcBorders>
+              <w:top w:val="single" w:sz="4" w:space="0" w:color="C5CDD6"/>
+              <w:left w:val="single" w:sz="4" w:space="0" w:color="C5CDD6"/>
+              <w:bottom w:val="single" w:sz="4" w:space="0" w:color="C5CDD6"/>
+              <w:right w:val="single" w:sz="4" w:space="0" w:color="C5CDD6"/>
+            </w:tcBorders>
+          </w:tcPr>
+          <w:p>
+            <w:pPr>
+              <w:spacing w:before="20" w:after="20"/>
+              <w:jc w:val="center"/>
+            </w:pPr>
+            <w:r/>
+            <w:r>
+              <w:rPr>
+                <w:rFonts w:ascii="Calibri" w:hAnsi="Calibri" w:eastAsia="Calibri"/>
+                <w:b/>
+                <w:color w:val="FFFFFF"/>
+                <w:sz w:val="22"/>
+              </w:rPr>
+              <w:t>8.  Diameter-wise steel quantity  —  not the same as diameter identification</w:t>
+            </w:r>
+          </w:p>
+        </w:tc>
+      </w:tr>
+    </w:tbl>
+    <w:p>
+      <w:pPr>
+        <w:spacing w:after="60"/>
+      </w:pPr>
+    </w:p>
+    <w:p>
+      <w:pPr>
+        <w:spacing w:after="100" w:before="0" w:line="259" w:lineRule="auto"/>
+      </w:pPr>
+      <w:r>
+        <w:rPr>
+          <w:rFonts w:ascii="Calibri" w:hAnsi="Calibri" w:eastAsia="Calibri"/>
+          <w:b w:val="0"/>
+          <w:color w:val="3D4A57"/>
+          <w:sz w:val="18"/>
+        </w:rPr>
+        <w:t>Quantity ratio = automated kg / estimated kg × 100. It is not accuracy. A ratio above 100% is an overestimate. This table pools kilogram totals by diameter before computing difference and ratio. It is not diameter identification.</w:t>
+      </w:r>
+    </w:p>
+    <w:tbl>
+      <w:tblPr>
+        <w:tblW w:type="dxa" w:w="9639"/>
+        <w:jc w:val="center"/>
+        <w:tblLayout w:type="fixed"/>
+        <w:tblLook w:firstColumn="1" w:firstRow="1" w:lastColumn="0" w:lastRow="0" w:noHBand="0" w:noVBand="1" w:val="04A0"/>
+      </w:tblPr>
+      <w:tblGrid>
+        <w:gridCol w:w="1663"/>
+        <w:gridCol w:w="1663"/>
+        <w:gridCol w:w="1663"/>
+        <w:gridCol w:w="1663"/>
+        <w:gridCol w:w="1663"/>
+        <w:gridCol w:w="1663"/>
+      </w:tblGrid>
+      <w:tr>
+        <w:tc>
+          <w:tcPr>
+            <w:tcW w:type="dxa" w:w="1361"/>
+            <w:shd w:fill="1B365D" w:val="clear"/>
+            <w:tcBorders>
+              <w:top w:val="single" w:sz="4" w:space="0" w:color="C5CDD6"/>
+              <w:left w:val="single" w:sz="4" w:space="0" w:color="C5CDD6"/>
+              <w:bottom w:val="single" w:sz="4" w:space="0" w:color="C5CDD6"/>
+              <w:right w:val="single" w:sz="4" w:space="0" w:color="C5CDD6"/>
+            </w:tcBorders>
+          </w:tcPr>
+          <w:p>
+            <w:pPr>
+              <w:spacing w:before="20" w:after="20"/>
+              <w:jc w:val="center"/>
+            </w:pPr>
+            <w:r/>
+            <w:r>
+              <w:rPr>
+                <w:rFonts w:ascii="Calibri" w:hAnsi="Calibri" w:eastAsia="Calibri"/>
+                <w:b/>
+                <w:color w:val="FFFFFF"/>
+                <w:sz w:val="15"/>
+              </w:rPr>
+              <w:t>Diameter</w:t>
+            </w:r>
+          </w:p>
+        </w:tc>
+        <w:tc>
+          <w:tcPr>
+            <w:tcW w:type="dxa" w:w="1701"/>
+            <w:shd w:fill="1B365D" w:val="clear"/>
+            <w:tcBorders>
+              <w:top w:val="single" w:sz="4" w:space="0" w:color="C5CDD6"/>
+              <w:left w:val="single" w:sz="4" w:space="0" w:color="C5CDD6"/>
+              <w:bottom w:val="single" w:sz="4" w:space="0" w:color="C5CDD6"/>
+              <w:right w:val="single" w:sz="4" w:space="0" w:color="C5CDD6"/>
+            </w:tcBorders>
+          </w:tcPr>
+          <w:p>
+            <w:pPr>
+              <w:spacing w:before="20" w:after="20"/>
+              <w:jc w:val="center"/>
+            </w:pPr>
+            <w:r/>
+            <w:r>
+              <w:rPr>
+                <w:rFonts w:ascii="Calibri" w:hAnsi="Calibri" w:eastAsia="Calibri"/>
+                <w:b/>
+                <w:color w:val="FFFFFF"/>
+                <w:sz w:val="15"/>
+              </w:rPr>
+              <w:t>Estimated kg</w:t>
+            </w:r>
+          </w:p>
+        </w:tc>
+        <w:tc>
+          <w:tcPr>
+            <w:tcW w:type="dxa" w:w="1701"/>
+            <w:shd w:fill="1B365D" w:val="clear"/>
+            <w:tcBorders>
+              <w:top w:val="single" w:sz="4" w:space="0" w:color="C5CDD6"/>
+              <w:left w:val="single" w:sz="4" w:space="0" w:color="C5CDD6"/>
+              <w:bottom w:val="single" w:sz="4" w:space="0" w:color="C5CDD6"/>
+              <w:right w:val="single" w:sz="4" w:space="0" w:color="C5CDD6"/>
+            </w:tcBorders>
+          </w:tcPr>
+          <w:p>
+            <w:pPr>
+              <w:spacing w:before="20" w:after="20"/>
+              <w:jc w:val="center"/>
+            </w:pPr>
+            <w:r/>
+            <w:r>
+              <w:rPr>
+                <w:rFonts w:ascii="Calibri" w:hAnsi="Calibri" w:eastAsia="Calibri"/>
+                <w:b/>
+                <w:color w:val="FFFFFF"/>
+                <w:sz w:val="15"/>
+              </w:rPr>
+              <w:t>Automated kg</w:t>
+            </w:r>
+          </w:p>
+        </w:tc>
+        <w:tc>
+          <w:tcPr>
+            <w:tcW w:type="dxa" w:w="1587"/>
+            <w:shd w:fill="1B365D" w:val="clear"/>
+            <w:tcBorders>
+              <w:top w:val="single" w:sz="4" w:space="0" w:color="C5CDD6"/>
+              <w:left w:val="single" w:sz="4" w:space="0" w:color="C5CDD6"/>
+              <w:bottom w:val="single" w:sz="4" w:space="0" w:color="C5CDD6"/>
+              <w:right w:val="single" w:sz="4" w:space="0" w:color="C5CDD6"/>
+            </w:tcBorders>
+          </w:tcPr>
+          <w:p>
+            <w:pPr>
+              <w:spacing w:before="20" w:after="20"/>
+              <w:jc w:val="center"/>
+            </w:pPr>
+            <w:r/>
+            <w:r>
+              <w:rPr>
+                <w:rFonts w:ascii="Calibri" w:hAnsi="Calibri" w:eastAsia="Calibri"/>
+                <w:b/>
+                <w:color w:val="FFFFFF"/>
+                <w:sz w:val="15"/>
+              </w:rPr>
+              <w:t>Difference kg</w:t>
+            </w:r>
+          </w:p>
+        </w:tc>
+        <w:tc>
+          <w:tcPr>
+            <w:tcW w:type="dxa" w:w="1361"/>
+            <w:shd w:fill="1B365D" w:val="clear"/>
+            <w:tcBorders>
+              <w:top w:val="single" w:sz="4" w:space="0" w:color="C5CDD6"/>
+              <w:left w:val="single" w:sz="4" w:space="0" w:color="C5CDD6"/>
+              <w:bottom w:val="single" w:sz="4" w:space="0" w:color="C5CDD6"/>
+              <w:right w:val="single" w:sz="4" w:space="0" w:color="C5CDD6"/>
+            </w:tcBorders>
+          </w:tcPr>
+          <w:p>
+            <w:pPr>
+              <w:spacing w:before="20" w:after="20"/>
+              <w:jc w:val="center"/>
+            </w:pPr>
+            <w:r/>
+            <w:r>
+              <w:rPr>
+                <w:rFonts w:ascii="Calibri" w:hAnsi="Calibri" w:eastAsia="Calibri"/>
+                <w:b/>
+                <w:color w:val="FFFFFF"/>
+                <w:sz w:val="15"/>
+              </w:rPr>
+              <w:t>Abs % diff</w:t>
+            </w:r>
+          </w:p>
+        </w:tc>
+        <w:tc>
+          <w:tcPr>
+            <w:tcW w:type="dxa" w:w="1928"/>
+            <w:shd w:fill="1B365D" w:val="clear"/>
+            <w:tcBorders>
+              <w:top w:val="single" w:sz="4" w:space="0" w:color="C5CDD6"/>
+              <w:left w:val="single" w:sz="4" w:space="0" w:color="C5CDD6"/>
+              <w:bottom w:val="single" w:sz="4" w:space="0" w:color="C5CDD6"/>
+              <w:right w:val="single" w:sz="4" w:space="0" w:color="C5CDD6"/>
+            </w:tcBorders>
+          </w:tcPr>
+          <w:p>
+            <w:pPr>
+              <w:spacing w:before="20" w:after="20"/>
+              <w:jc w:val="center"/>
+            </w:pPr>
+            <w:r/>
+            <w:r>
+              <w:rPr>
+                <w:rFonts w:ascii="Calibri" w:hAnsi="Calibri" w:eastAsia="Calibri"/>
+                <w:b/>
+                <w:color w:val="FFFFFF"/>
+                <w:sz w:val="15"/>
+              </w:rPr>
+              <w:t>Quantity ratio</w:t>
+            </w:r>
+          </w:p>
+        </w:tc>
+      </w:tr>
+      <w:tr>
+        <w:tc>
+          <w:tcPr>
+            <w:tcW w:type="dxa" w:w="1361"/>
+            <w:shd w:fill="FFFFFF" w:val="clear"/>
+            <w:tcBorders>
+              <w:top w:val="single" w:sz="4" w:space="0" w:color="C5CDD6"/>
+              <w:left w:val="single" w:sz="4" w:space="0" w:color="C5CDD6"/>
+              <w:bottom w:val="single" w:sz="4" w:space="0" w:color="C5CDD6"/>
+              <w:right w:val="single" w:sz="4" w:space="0" w:color="C5CDD6"/>
+            </w:tcBorders>
+          </w:tcPr>
+          <w:p>
+            <w:pPr>
+              <w:spacing w:before="20" w:after="20"/>
+              <w:jc w:val="left"/>
+            </w:pPr>
+            <w:r/>
+            <w:r>
+              <w:rPr>
+                <w:rFonts w:ascii="Calibri" w:hAnsi="Calibri" w:eastAsia="Calibri"/>
+                <w:b/>
+                <w:color w:val="1B365D"/>
+                <w:sz w:val="16"/>
+              </w:rPr>
+              <w:t>Ø8</w:t>
+            </w:r>
+          </w:p>
+        </w:tc>
+        <w:tc>
+          <w:tcPr>
+            <w:tcW w:type="dxa" w:w="1701"/>
+            <w:shd w:fill="FFFFFF" w:val="clear"/>
+            <w:tcBorders>
+              <w:top w:val="single" w:sz="4" w:space="0" w:color="C5CDD6"/>
+              <w:left w:val="single" w:sz="4" w:space="0" w:color="C5CDD6"/>
+              <w:bottom w:val="single" w:sz="4" w:space="0" w:color="C5CDD6"/>
+              <w:right w:val="single" w:sz="4" w:space="0" w:color="C5CDD6"/>
+            </w:tcBorders>
+          </w:tcPr>
+          <w:p>
+            <w:pPr>
+              <w:spacing w:before="20" w:after="20"/>
+              <w:jc w:val="center"/>
+            </w:pPr>
+            <w:r/>
+            <w:r>
+              <w:rPr>
+                <w:rFonts w:ascii="Calibri" w:hAnsi="Calibri" w:eastAsia="Calibri"/>
+                <w:b w:val="0"/>
+                <w:color w:val="3D4A57"/>
+                <w:sz w:val="16"/>
+              </w:rPr>
+              <w:t>6,515</w:t>
+            </w:r>
+          </w:p>
+        </w:tc>
+        <w:tc>
+          <w:tcPr>
+            <w:tcW w:type="dxa" w:w="1701"/>
+            <w:shd w:fill="FFFFFF" w:val="clear"/>
+            <w:tcBorders>
+              <w:top w:val="single" w:sz="4" w:space="0" w:color="C5CDD6"/>
+              <w:left w:val="single" w:sz="4" w:space="0" w:color="C5CDD6"/>
+              <w:bottom w:val="single" w:sz="4" w:space="0" w:color="C5CDD6"/>
+              <w:right w:val="single" w:sz="4" w:space="0" w:color="C5CDD6"/>
+            </w:tcBorders>
+          </w:tcPr>
+          <w:p>
+            <w:pPr>
+              <w:spacing w:before="20" w:after="20"/>
+              <w:jc w:val="center"/>
+            </w:pPr>
+            <w:r/>
+            <w:r>
+              <w:rPr>
+                <w:rFonts w:ascii="Calibri" w:hAnsi="Calibri" w:eastAsia="Calibri"/>
+                <w:b w:val="0"/>
+                <w:color w:val="3D4A57"/>
+                <w:sz w:val="16"/>
+              </w:rPr>
+              <w:t>5,051</w:t>
+            </w:r>
+          </w:p>
+        </w:tc>
+        <w:tc>
+          <w:tcPr>
+            <w:tcW w:type="dxa" w:w="1587"/>
+            <w:shd w:fill="FFFFFF" w:val="clear"/>
+            <w:tcBorders>
+              <w:top w:val="single" w:sz="4" w:space="0" w:color="C5CDD6"/>
+              <w:left w:val="single" w:sz="4" w:space="0" w:color="C5CDD6"/>
+              <w:bottom w:val="single" w:sz="4" w:space="0" w:color="C5CDD6"/>
+              <w:right w:val="single" w:sz="4" w:space="0" w:color="C5CDD6"/>
+            </w:tcBorders>
+          </w:tcPr>
+          <w:p>
+            <w:pPr>
+              <w:spacing w:before="20" w:after="20"/>
+              <w:jc w:val="center"/>
+            </w:pPr>
+            <w:r/>
+            <w:r>
+              <w:rPr>
+                <w:rFonts w:ascii="Calibri" w:hAnsi="Calibri" w:eastAsia="Calibri"/>
+                <w:b w:val="0"/>
+                <w:color w:val="3D4A57"/>
+                <w:sz w:val="16"/>
+              </w:rPr>
+              <w:t>−1,464</w:t>
+            </w:r>
+          </w:p>
+        </w:tc>
+        <w:tc>
+          <w:tcPr>
+            <w:tcW w:type="dxa" w:w="1361"/>
+            <w:shd w:fill="FFFFFF" w:val="clear"/>
+            <w:tcBorders>
+              <w:top w:val="single" w:sz="4" w:space="0" w:color="C5CDD6"/>
+              <w:left w:val="single" w:sz="4" w:space="0" w:color="C5CDD6"/>
+              <w:bottom w:val="single" w:sz="4" w:space="0" w:color="C5CDD6"/>
+              <w:right w:val="single" w:sz="4" w:space="0" w:color="C5CDD6"/>
+            </w:tcBorders>
+          </w:tcPr>
+          <w:p>
+            <w:pPr>
+              <w:spacing w:before="20" w:after="20"/>
+              <w:jc w:val="center"/>
+            </w:pPr>
+            <w:r/>
+            <w:r>
+              <w:rPr>
+                <w:rFonts w:ascii="Calibri" w:hAnsi="Calibri" w:eastAsia="Calibri"/>
+                <w:b w:val="0"/>
+                <w:color w:val="3D4A57"/>
+                <w:sz w:val="16"/>
+              </w:rPr>
+              <w:t>22.5%</w:t>
+            </w:r>
+          </w:p>
+        </w:tc>
+        <w:tc>
+          <w:tcPr>
+            <w:tcW w:type="dxa" w:w="1928"/>
+            <w:shd w:fill="FFFFFF" w:val="clear"/>
+            <w:tcBorders>
+              <w:top w:val="single" w:sz="4" w:space="0" w:color="C5CDD6"/>
+              <w:left w:val="single" w:sz="4" w:space="0" w:color="C5CDD6"/>
+              <w:bottom w:val="single" w:sz="4" w:space="0" w:color="C5CDD6"/>
+              <w:right w:val="single" w:sz="4" w:space="0" w:color="C5CDD6"/>
+            </w:tcBorders>
+          </w:tcPr>
+          <w:p>
+            <w:pPr>
+              <w:spacing w:before="20" w:after="20"/>
+              <w:jc w:val="center"/>
+            </w:pPr>
+            <w:r/>
+            <w:r>
+              <w:rPr>
+                <w:rFonts w:ascii="Calibri" w:hAnsi="Calibri" w:eastAsia="Calibri"/>
+                <w:b w:val="0"/>
+                <w:color w:val="3D4A57"/>
+                <w:sz w:val="16"/>
+              </w:rPr>
+              <w:t>78%</w:t>
+            </w:r>
+          </w:p>
+        </w:tc>
+      </w:tr>
+      <w:tr>
+        <w:tc>
+          <w:tcPr>
+            <w:tcW w:type="dxa" w:w="1361"/>
+            <w:shd w:fill="F4F7FA" w:val="clear"/>
+            <w:tcBorders>
+              <w:top w:val="single" w:sz="4" w:space="0" w:color="C5CDD6"/>
+              <w:left w:val="single" w:sz="4" w:space="0" w:color="C5CDD6"/>
+              <w:bottom w:val="single" w:sz="4" w:space="0" w:color="C5CDD6"/>
+              <w:right w:val="single" w:sz="4" w:space="0" w:color="C5CDD6"/>
+            </w:tcBorders>
+          </w:tcPr>
+          <w:p>
+            <w:pPr>
+              <w:spacing w:before="20" w:after="20"/>
+              <w:jc w:val="left"/>
+            </w:pPr>
+            <w:r/>
+            <w:r>
+              <w:rPr>
+                <w:rFonts w:ascii="Calibri" w:hAnsi="Calibri" w:eastAsia="Calibri"/>
+                <w:b/>
+                <w:color w:val="1B365D"/>
+                <w:sz w:val="16"/>
+              </w:rPr>
+              <w:t>Ø10</w:t>
+            </w:r>
+          </w:p>
+        </w:tc>
+        <w:tc>
+          <w:tcPr>
+            <w:tcW w:type="dxa" w:w="1701"/>
+            <w:shd w:fill="F4F7FA" w:val="clear"/>
+            <w:tcBorders>
+              <w:top w:val="single" w:sz="4" w:space="0" w:color="C5CDD6"/>
+              <w:left w:val="single" w:sz="4" w:space="0" w:color="C5CDD6"/>
+              <w:bottom w:val="single" w:sz="4" w:space="0" w:color="C5CDD6"/>
+              <w:right w:val="single" w:sz="4" w:space="0" w:color="C5CDD6"/>
+            </w:tcBorders>
+          </w:tcPr>
+          <w:p>
+            <w:pPr>
+              <w:spacing w:before="20" w:after="20"/>
+              <w:jc w:val="center"/>
+            </w:pPr>
+            <w:r/>
+            <w:r>
+              <w:rPr>
+                <w:rFonts w:ascii="Calibri" w:hAnsi="Calibri" w:eastAsia="Calibri"/>
+                <w:b w:val="0"/>
+                <w:color w:val="3D4A57"/>
+                <w:sz w:val="16"/>
+              </w:rPr>
+              <w:t>24,555</w:t>
+            </w:r>
+          </w:p>
+        </w:tc>
+        <w:tc>
+          <w:tcPr>
+            <w:tcW w:type="dxa" w:w="1701"/>
+            <w:shd w:fill="F4F7FA" w:val="clear"/>
+            <w:tcBorders>
+              <w:top w:val="single" w:sz="4" w:space="0" w:color="C5CDD6"/>
+              <w:left w:val="single" w:sz="4" w:space="0" w:color="C5CDD6"/>
+              <w:bottom w:val="single" w:sz="4" w:space="0" w:color="C5CDD6"/>
+              <w:right w:val="single" w:sz="4" w:space="0" w:color="C5CDD6"/>
+            </w:tcBorders>
+          </w:tcPr>
+          <w:p>
+            <w:pPr>
+              <w:spacing w:before="20" w:after="20"/>
+              <w:jc w:val="center"/>
+            </w:pPr>
+            <w:r/>
+            <w:r>
+              <w:rPr>
+                <w:rFonts w:ascii="Calibri" w:hAnsi="Calibri" w:eastAsia="Calibri"/>
+                <w:b w:val="0"/>
+                <w:color w:val="3D4A57"/>
+                <w:sz w:val="16"/>
+              </w:rPr>
+              <w:t>14,163</w:t>
+            </w:r>
+          </w:p>
+        </w:tc>
+        <w:tc>
+          <w:tcPr>
+            <w:tcW w:type="dxa" w:w="1587"/>
+            <w:shd w:fill="F4F7FA" w:val="clear"/>
+            <w:tcBorders>
+              <w:top w:val="single" w:sz="4" w:space="0" w:color="C5CDD6"/>
+              <w:left w:val="single" w:sz="4" w:space="0" w:color="C5CDD6"/>
+              <w:bottom w:val="single" w:sz="4" w:space="0" w:color="C5CDD6"/>
+              <w:right w:val="single" w:sz="4" w:space="0" w:color="C5CDD6"/>
+            </w:tcBorders>
+          </w:tcPr>
+          <w:p>
+            <w:pPr>
+              <w:spacing w:before="20" w:after="20"/>
+              <w:jc w:val="center"/>
+            </w:pPr>
+            <w:r/>
+            <w:r>
+              <w:rPr>
+                <w:rFonts w:ascii="Calibri" w:hAnsi="Calibri" w:eastAsia="Calibri"/>
+                <w:b w:val="0"/>
+                <w:color w:val="3D4A57"/>
+                <w:sz w:val="16"/>
+              </w:rPr>
+              <w:t>−10,393</w:t>
+            </w:r>
+          </w:p>
+        </w:tc>
+        <w:tc>
+          <w:tcPr>
+            <w:tcW w:type="dxa" w:w="1361"/>
+            <w:shd w:fill="F4F7FA" w:val="clear"/>
+            <w:tcBorders>
+              <w:top w:val="single" w:sz="4" w:space="0" w:color="C5CDD6"/>
+              <w:left w:val="single" w:sz="4" w:space="0" w:color="C5CDD6"/>
+              <w:bottom w:val="single" w:sz="4" w:space="0" w:color="C5CDD6"/>
+              <w:right w:val="single" w:sz="4" w:space="0" w:color="C5CDD6"/>
+            </w:tcBorders>
+          </w:tcPr>
+          <w:p>
+            <w:pPr>
+              <w:spacing w:before="20" w:after="20"/>
+              <w:jc w:val="center"/>
+            </w:pPr>
+            <w:r/>
+            <w:r>
+              <w:rPr>
+                <w:rFonts w:ascii="Calibri" w:hAnsi="Calibri" w:eastAsia="Calibri"/>
+                <w:b w:val="0"/>
+                <w:color w:val="3D4A57"/>
+                <w:sz w:val="16"/>
+              </w:rPr>
+              <w:t>42.3%</w:t>
+            </w:r>
+          </w:p>
+        </w:tc>
+        <w:tc>
+          <w:tcPr>
+            <w:tcW w:type="dxa" w:w="1928"/>
+            <w:shd w:fill="F4F7FA" w:val="clear"/>
+            <w:tcBorders>
+              <w:top w:val="single" w:sz="4" w:space="0" w:color="C5CDD6"/>
+              <w:left w:val="single" w:sz="4" w:space="0" w:color="C5CDD6"/>
+              <w:bottom w:val="single" w:sz="4" w:space="0" w:color="C5CDD6"/>
+              <w:right w:val="single" w:sz="4" w:space="0" w:color="C5CDD6"/>
+            </w:tcBorders>
+          </w:tcPr>
+          <w:p>
+            <w:pPr>
+              <w:spacing w:before="20" w:after="20"/>
+              <w:jc w:val="center"/>
+            </w:pPr>
+            <w:r/>
+            <w:r>
+              <w:rPr>
+                <w:rFonts w:ascii="Calibri" w:hAnsi="Calibri" w:eastAsia="Calibri"/>
+                <w:b w:val="0"/>
+                <w:color w:val="3D4A57"/>
+                <w:sz w:val="16"/>
+              </w:rPr>
+              <w:t>58%</w:t>
+            </w:r>
+          </w:p>
+        </w:tc>
+      </w:tr>
+      <w:tr>
+        <w:tc>
+          <w:tcPr>
+            <w:tcW w:type="dxa" w:w="1361"/>
+            <w:shd w:fill="FFFFFF" w:val="clear"/>
+            <w:tcBorders>
+              <w:top w:val="single" w:sz="4" w:space="0" w:color="C5CDD6"/>
+              <w:left w:val="single" w:sz="4" w:space="0" w:color="C5CDD6"/>
+              <w:bottom w:val="single" w:sz="4" w:space="0" w:color="C5CDD6"/>
+              <w:right w:val="single" w:sz="4" w:space="0" w:color="C5CDD6"/>
+            </w:tcBorders>
+          </w:tcPr>
+          <w:p>
+            <w:pPr>
+              <w:spacing w:before="20" w:after="20"/>
+              <w:jc w:val="left"/>
+            </w:pPr>
+            <w:r/>
+            <w:r>
+              <w:rPr>
+                <w:rFonts w:ascii="Calibri" w:hAnsi="Calibri" w:eastAsia="Calibri"/>
+                <w:b/>
+                <w:color w:val="1B365D"/>
+                <w:sz w:val="16"/>
+              </w:rPr>
+              <w:t>Ø12</w:t>
+            </w:r>
+          </w:p>
+        </w:tc>
+        <w:tc>
+          <w:tcPr>
+            <w:tcW w:type="dxa" w:w="1701"/>
+            <w:shd w:fill="FFFFFF" w:val="clear"/>
+            <w:tcBorders>
+              <w:top w:val="single" w:sz="4" w:space="0" w:color="C5CDD6"/>
+              <w:left w:val="single" w:sz="4" w:space="0" w:color="C5CDD6"/>
+              <w:bottom w:val="single" w:sz="4" w:space="0" w:color="C5CDD6"/>
+              <w:right w:val="single" w:sz="4" w:space="0" w:color="C5CDD6"/>
+            </w:tcBorders>
+          </w:tcPr>
+          <w:p>
+            <w:pPr>
+              <w:spacing w:before="20" w:after="20"/>
+              <w:jc w:val="center"/>
+            </w:pPr>
+            <w:r/>
+            <w:r>
+              <w:rPr>
+                <w:rFonts w:ascii="Calibri" w:hAnsi="Calibri" w:eastAsia="Calibri"/>
+                <w:b w:val="0"/>
+                <w:color w:val="3D4A57"/>
+                <w:sz w:val="16"/>
+              </w:rPr>
+              <w:t>22,253</w:t>
+            </w:r>
+          </w:p>
+        </w:tc>
+        <w:tc>
+          <w:tcPr>
+            <w:tcW w:type="dxa" w:w="1701"/>
+            <w:shd w:fill="FFFFFF" w:val="clear"/>
+            <w:tcBorders>
+              <w:top w:val="single" w:sz="4" w:space="0" w:color="C5CDD6"/>
+              <w:left w:val="single" w:sz="4" w:space="0" w:color="C5CDD6"/>
+              <w:bottom w:val="single" w:sz="4" w:space="0" w:color="C5CDD6"/>
+              <w:right w:val="single" w:sz="4" w:space="0" w:color="C5CDD6"/>
+            </w:tcBorders>
+          </w:tcPr>
+          <w:p>
+            <w:pPr>
+              <w:spacing w:before="20" w:after="20"/>
+              <w:jc w:val="center"/>
+            </w:pPr>
+            <w:r/>
+            <w:r>
+              <w:rPr>
+                <w:rFonts w:ascii="Calibri" w:hAnsi="Calibri" w:eastAsia="Calibri"/>
+                <w:b w:val="0"/>
+                <w:color w:val="3D4A57"/>
+                <w:sz w:val="16"/>
+              </w:rPr>
+              <w:t>12,722</w:t>
+            </w:r>
+          </w:p>
+        </w:tc>
+        <w:tc>
+          <w:tcPr>
+            <w:tcW w:type="dxa" w:w="1587"/>
+            <w:shd w:fill="FFFFFF" w:val="clear"/>
+            <w:tcBorders>
+              <w:top w:val="single" w:sz="4" w:space="0" w:color="C5CDD6"/>
+              <w:left w:val="single" w:sz="4" w:space="0" w:color="C5CDD6"/>
+              <w:bottom w:val="single" w:sz="4" w:space="0" w:color="C5CDD6"/>
+              <w:right w:val="single" w:sz="4" w:space="0" w:color="C5CDD6"/>
+            </w:tcBorders>
+          </w:tcPr>
+          <w:p>
+            <w:pPr>
+              <w:spacing w:before="20" w:after="20"/>
+              <w:jc w:val="center"/>
+            </w:pPr>
+            <w:r/>
+            <w:r>
+              <w:rPr>
+                <w:rFonts w:ascii="Calibri" w:hAnsi="Calibri" w:eastAsia="Calibri"/>
+                <w:b w:val="0"/>
+                <w:color w:val="3D4A57"/>
+                <w:sz w:val="16"/>
+              </w:rPr>
+              <w:t>−9,531</w:t>
+            </w:r>
+          </w:p>
+        </w:tc>
+        <w:tc>
+          <w:tcPr>
+            <w:tcW w:type="dxa" w:w="1361"/>
+            <w:shd w:fill="FFFFFF" w:val="clear"/>
+            <w:tcBorders>
+              <w:top w:val="single" w:sz="4" w:space="0" w:color="C5CDD6"/>
+              <w:left w:val="single" w:sz="4" w:space="0" w:color="C5CDD6"/>
+              <w:bottom w:val="single" w:sz="4" w:space="0" w:color="C5CDD6"/>
+              <w:right w:val="single" w:sz="4" w:space="0" w:color="C5CDD6"/>
+            </w:tcBorders>
+          </w:tcPr>
+          <w:p>
+            <w:pPr>
+              <w:spacing w:before="20" w:after="20"/>
+              <w:jc w:val="center"/>
+            </w:pPr>
+            <w:r/>
+            <w:r>
+              <w:rPr>
+                <w:rFonts w:ascii="Calibri" w:hAnsi="Calibri" w:eastAsia="Calibri"/>
+                <w:b w:val="0"/>
+                <w:color w:val="3D4A57"/>
+                <w:sz w:val="16"/>
+              </w:rPr>
+              <w:t>42.8%</w:t>
+            </w:r>
+          </w:p>
+        </w:tc>
+        <w:tc>
+          <w:tcPr>
+            <w:tcW w:type="dxa" w:w="1928"/>
+            <w:shd w:fill="FFFFFF" w:val="clear"/>
+            <w:tcBorders>
+              <w:top w:val="single" w:sz="4" w:space="0" w:color="C5CDD6"/>
+              <w:left w:val="single" w:sz="4" w:space="0" w:color="C5CDD6"/>
+              <w:bottom w:val="single" w:sz="4" w:space="0" w:color="C5CDD6"/>
+              <w:right w:val="single" w:sz="4" w:space="0" w:color="C5CDD6"/>
+            </w:tcBorders>
+          </w:tcPr>
+          <w:p>
+            <w:pPr>
+              <w:spacing w:before="20" w:after="20"/>
+              <w:jc w:val="center"/>
+            </w:pPr>
+            <w:r/>
+            <w:r>
+              <w:rPr>
+                <w:rFonts w:ascii="Calibri" w:hAnsi="Calibri" w:eastAsia="Calibri"/>
+                <w:b w:val="0"/>
+                <w:color w:val="3D4A57"/>
+                <w:sz w:val="16"/>
+              </w:rPr>
+              <w:t>57%</w:t>
+            </w:r>
+          </w:p>
+        </w:tc>
+      </w:tr>
+      <w:tr>
+        <w:tc>
+          <w:tcPr>
+            <w:tcW w:type="dxa" w:w="1361"/>
+            <w:shd w:fill="F4F7FA" w:val="clear"/>
+            <w:tcBorders>
+              <w:top w:val="single" w:sz="4" w:space="0" w:color="C5CDD6"/>
+              <w:left w:val="single" w:sz="4" w:space="0" w:color="C5CDD6"/>
+              <w:bottom w:val="single" w:sz="4" w:space="0" w:color="C5CDD6"/>
+              <w:right w:val="single" w:sz="4" w:space="0" w:color="C5CDD6"/>
+            </w:tcBorders>
+          </w:tcPr>
+          <w:p>
+            <w:pPr>
+              <w:spacing w:before="20" w:after="20"/>
+              <w:jc w:val="left"/>
+            </w:pPr>
+            <w:r/>
+            <w:r>
+              <w:rPr>
+                <w:rFonts w:ascii="Calibri" w:hAnsi="Calibri" w:eastAsia="Calibri"/>
+                <w:b/>
+                <w:color w:val="1B365D"/>
+                <w:sz w:val="16"/>
+              </w:rPr>
+              <w:t>Ø16</w:t>
+            </w:r>
+          </w:p>
+        </w:tc>
+        <w:tc>
+          <w:tcPr>
+            <w:tcW w:type="dxa" w:w="1701"/>
+            <w:shd w:fill="F4F7FA" w:val="clear"/>
+            <w:tcBorders>
+              <w:top w:val="single" w:sz="4" w:space="0" w:color="C5CDD6"/>
+              <w:left w:val="single" w:sz="4" w:space="0" w:color="C5CDD6"/>
+              <w:bottom w:val="single" w:sz="4" w:space="0" w:color="C5CDD6"/>
+              <w:right w:val="single" w:sz="4" w:space="0" w:color="C5CDD6"/>
+            </w:tcBorders>
+          </w:tcPr>
+          <w:p>
+            <w:pPr>
+              <w:spacing w:before="20" w:after="20"/>
+              <w:jc w:val="center"/>
+            </w:pPr>
+            <w:r/>
+            <w:r>
+              <w:rPr>
+                <w:rFonts w:ascii="Calibri" w:hAnsi="Calibri" w:eastAsia="Calibri"/>
+                <w:b w:val="0"/>
+                <w:color w:val="3D4A57"/>
+                <w:sz w:val="16"/>
+              </w:rPr>
+              <w:t>11,598</w:t>
+            </w:r>
+          </w:p>
+        </w:tc>
+        <w:tc>
+          <w:tcPr>
+            <w:tcW w:type="dxa" w:w="1701"/>
+            <w:shd w:fill="F4F7FA" w:val="clear"/>
+            <w:tcBorders>
+              <w:top w:val="single" w:sz="4" w:space="0" w:color="C5CDD6"/>
+              <w:left w:val="single" w:sz="4" w:space="0" w:color="C5CDD6"/>
+              <w:bottom w:val="single" w:sz="4" w:space="0" w:color="C5CDD6"/>
+              <w:right w:val="single" w:sz="4" w:space="0" w:color="C5CDD6"/>
+            </w:tcBorders>
+          </w:tcPr>
+          <w:p>
+            <w:pPr>
+              <w:spacing w:before="20" w:after="20"/>
+              <w:jc w:val="center"/>
+            </w:pPr>
+            <w:r/>
+            <w:r>
+              <w:rPr>
+                <w:rFonts w:ascii="Calibri" w:hAnsi="Calibri" w:eastAsia="Calibri"/>
+                <w:b w:val="0"/>
+                <w:color w:val="3D4A57"/>
+                <w:sz w:val="16"/>
+              </w:rPr>
+              <w:t>7,678</w:t>
+            </w:r>
+          </w:p>
+        </w:tc>
+        <w:tc>
+          <w:tcPr>
+            <w:tcW w:type="dxa" w:w="1587"/>
+            <w:shd w:fill="F4F7FA" w:val="clear"/>
+            <w:tcBorders>
+              <w:top w:val="single" w:sz="4" w:space="0" w:color="C5CDD6"/>
+              <w:left w:val="single" w:sz="4" w:space="0" w:color="C5CDD6"/>
+              <w:bottom w:val="single" w:sz="4" w:space="0" w:color="C5CDD6"/>
+              <w:right w:val="single" w:sz="4" w:space="0" w:color="C5CDD6"/>
+            </w:tcBorders>
+          </w:tcPr>
+          <w:p>
+            <w:pPr>
+              <w:spacing w:before="20" w:after="20"/>
+              <w:jc w:val="center"/>
+            </w:pPr>
+            <w:r/>
+            <w:r>
+              <w:rPr>
+                <w:rFonts w:ascii="Calibri" w:hAnsi="Calibri" w:eastAsia="Calibri"/>
+                <w:b w:val="0"/>
+                <w:color w:val="3D4A57"/>
+                <w:sz w:val="16"/>
+              </w:rPr>
+              <w:t>−3,920</w:t>
+            </w:r>
+          </w:p>
+        </w:tc>
+        <w:tc>
+          <w:tcPr>
+            <w:tcW w:type="dxa" w:w="1361"/>
+            <w:shd w:fill="F4F7FA" w:val="clear"/>
+            <w:tcBorders>
+              <w:top w:val="single" w:sz="4" w:space="0" w:color="C5CDD6"/>
+              <w:left w:val="single" w:sz="4" w:space="0" w:color="C5CDD6"/>
+              <w:bottom w:val="single" w:sz="4" w:space="0" w:color="C5CDD6"/>
+              <w:right w:val="single" w:sz="4" w:space="0" w:color="C5CDD6"/>
+            </w:tcBorders>
+          </w:tcPr>
+          <w:p>
+            <w:pPr>
+              <w:spacing w:before="20" w:after="20"/>
+              <w:jc w:val="center"/>
+            </w:pPr>
+            <w:r/>
+            <w:r>
+              <w:rPr>
+                <w:rFonts w:ascii="Calibri" w:hAnsi="Calibri" w:eastAsia="Calibri"/>
+                <w:b w:val="0"/>
+                <w:color w:val="3D4A57"/>
+                <w:sz w:val="16"/>
+              </w:rPr>
+              <w:t>33.8%</w:t>
+            </w:r>
+          </w:p>
+        </w:tc>
+        <w:tc>
+          <w:tcPr>
+            <w:tcW w:type="dxa" w:w="1928"/>
+            <w:shd w:fill="F4F7FA" w:val="clear"/>
+            <w:tcBorders>
+              <w:top w:val="single" w:sz="4" w:space="0" w:color="C5CDD6"/>
+              <w:left w:val="single" w:sz="4" w:space="0" w:color="C5CDD6"/>
+              <w:bottom w:val="single" w:sz="4" w:space="0" w:color="C5CDD6"/>
+              <w:right w:val="single" w:sz="4" w:space="0" w:color="C5CDD6"/>
+            </w:tcBorders>
+          </w:tcPr>
+          <w:p>
+            <w:pPr>
+              <w:spacing w:before="20" w:after="20"/>
+              <w:jc w:val="center"/>
+            </w:pPr>
+            <w:r/>
+            <w:r>
+              <w:rPr>
+                <w:rFonts w:ascii="Calibri" w:hAnsi="Calibri" w:eastAsia="Calibri"/>
+                <w:b w:val="0"/>
+                <w:color w:val="3D4A57"/>
+                <w:sz w:val="16"/>
+              </w:rPr>
+              <w:t>66%</w:t>
+            </w:r>
+          </w:p>
+        </w:tc>
+      </w:tr>
+      <w:tr>
+        <w:tc>
+          <w:tcPr>
+            <w:tcW w:type="dxa" w:w="1361"/>
+            <w:shd w:fill="FFFFFF" w:val="clear"/>
+            <w:tcBorders>
+              <w:top w:val="single" w:sz="4" w:space="0" w:color="C5CDD6"/>
+              <w:left w:val="single" w:sz="4" w:space="0" w:color="C5CDD6"/>
+              <w:bottom w:val="single" w:sz="4" w:space="0" w:color="C5CDD6"/>
+              <w:right w:val="single" w:sz="4" w:space="0" w:color="C5CDD6"/>
+            </w:tcBorders>
+          </w:tcPr>
+          <w:p>
+            <w:pPr>
+              <w:spacing w:before="20" w:after="20"/>
+              <w:jc w:val="left"/>
+            </w:pPr>
+            <w:r/>
+            <w:r>
+              <w:rPr>
+                <w:rFonts w:ascii="Calibri" w:hAnsi="Calibri" w:eastAsia="Calibri"/>
+                <w:b/>
+                <w:color w:val="1B365D"/>
+                <w:sz w:val="16"/>
+              </w:rPr>
+              <w:t>Ø20</w:t>
+            </w:r>
+          </w:p>
+        </w:tc>
+        <w:tc>
+          <w:tcPr>
+            <w:tcW w:type="dxa" w:w="1701"/>
+            <w:shd w:fill="FFFFFF" w:val="clear"/>
+            <w:tcBorders>
+              <w:top w:val="single" w:sz="4" w:space="0" w:color="C5CDD6"/>
+              <w:left w:val="single" w:sz="4" w:space="0" w:color="C5CDD6"/>
+              <w:bottom w:val="single" w:sz="4" w:space="0" w:color="C5CDD6"/>
+              <w:right w:val="single" w:sz="4" w:space="0" w:color="C5CDD6"/>
+            </w:tcBorders>
+          </w:tcPr>
+          <w:p>
+            <w:pPr>
+              <w:spacing w:before="20" w:after="20"/>
+              <w:jc w:val="center"/>
+            </w:pPr>
+            <w:r/>
+            <w:r>
+              <w:rPr>
+                <w:rFonts w:ascii="Calibri" w:hAnsi="Calibri" w:eastAsia="Calibri"/>
+                <w:b w:val="0"/>
+                <w:color w:val="3D4A57"/>
+                <w:sz w:val="16"/>
+              </w:rPr>
+              <w:t>35,888</w:t>
+            </w:r>
+          </w:p>
+        </w:tc>
+        <w:tc>
+          <w:tcPr>
+            <w:tcW w:type="dxa" w:w="1701"/>
+            <w:shd w:fill="FFFFFF" w:val="clear"/>
+            <w:tcBorders>
+              <w:top w:val="single" w:sz="4" w:space="0" w:color="C5CDD6"/>
+              <w:left w:val="single" w:sz="4" w:space="0" w:color="C5CDD6"/>
+              <w:bottom w:val="single" w:sz="4" w:space="0" w:color="C5CDD6"/>
+              <w:right w:val="single" w:sz="4" w:space="0" w:color="C5CDD6"/>
+            </w:tcBorders>
+          </w:tcPr>
+          <w:p>
+            <w:pPr>
+              <w:spacing w:before="20" w:after="20"/>
+              <w:jc w:val="center"/>
+            </w:pPr>
+            <w:r/>
+            <w:r>
+              <w:rPr>
+                <w:rFonts w:ascii="Calibri" w:hAnsi="Calibri" w:eastAsia="Calibri"/>
+                <w:b w:val="0"/>
+                <w:color w:val="3D4A57"/>
+                <w:sz w:val="16"/>
+              </w:rPr>
+              <w:t>20,506</w:t>
+            </w:r>
+          </w:p>
+        </w:tc>
+        <w:tc>
+          <w:tcPr>
+            <w:tcW w:type="dxa" w:w="1587"/>
+            <w:shd w:fill="FFFFFF" w:val="clear"/>
+            <w:tcBorders>
+              <w:top w:val="single" w:sz="4" w:space="0" w:color="C5CDD6"/>
+              <w:left w:val="single" w:sz="4" w:space="0" w:color="C5CDD6"/>
+              <w:bottom w:val="single" w:sz="4" w:space="0" w:color="C5CDD6"/>
+              <w:right w:val="single" w:sz="4" w:space="0" w:color="C5CDD6"/>
+            </w:tcBorders>
+          </w:tcPr>
+          <w:p>
+            <w:pPr>
+              <w:spacing w:before="20" w:after="20"/>
+              <w:jc w:val="center"/>
+            </w:pPr>
+            <w:r/>
+            <w:r>
+              <w:rPr>
+                <w:rFonts w:ascii="Calibri" w:hAnsi="Calibri" w:eastAsia="Calibri"/>
+                <w:b w:val="0"/>
+                <w:color w:val="3D4A57"/>
+                <w:sz w:val="16"/>
+              </w:rPr>
+              <w:t>−15,382</w:t>
+            </w:r>
+          </w:p>
+        </w:tc>
+        <w:tc>
+          <w:tcPr>
+            <w:tcW w:type="dxa" w:w="1361"/>
+            <w:shd w:fill="FFFFFF" w:val="clear"/>
+            <w:tcBorders>
+              <w:top w:val="single" w:sz="4" w:space="0" w:color="C5CDD6"/>
+              <w:left w:val="single" w:sz="4" w:space="0" w:color="C5CDD6"/>
+              <w:bottom w:val="single" w:sz="4" w:space="0" w:color="C5CDD6"/>
+              <w:right w:val="single" w:sz="4" w:space="0" w:color="C5CDD6"/>
+            </w:tcBorders>
+          </w:tcPr>
+          <w:p>
+            <w:pPr>
+              <w:spacing w:before="20" w:after="20"/>
+              <w:jc w:val="center"/>
+            </w:pPr>
+            <w:r/>
+            <w:r>
+              <w:rPr>
+                <w:rFonts w:ascii="Calibri" w:hAnsi="Calibri" w:eastAsia="Calibri"/>
+                <w:b w:val="0"/>
+                <w:color w:val="3D4A57"/>
+                <w:sz w:val="16"/>
+              </w:rPr>
+              <w:t>42.9%</w:t>
+            </w:r>
+          </w:p>
+        </w:tc>
+        <w:tc>
+          <w:tcPr>
+            <w:tcW w:type="dxa" w:w="1928"/>
+            <w:shd w:fill="FFFFFF" w:val="clear"/>
+            <w:tcBorders>
+              <w:top w:val="single" w:sz="4" w:space="0" w:color="C5CDD6"/>
+              <w:left w:val="single" w:sz="4" w:space="0" w:color="C5CDD6"/>
+              <w:bottom w:val="single" w:sz="4" w:space="0" w:color="C5CDD6"/>
+              <w:right w:val="single" w:sz="4" w:space="0" w:color="C5CDD6"/>
+            </w:tcBorders>
+          </w:tcPr>
+          <w:p>
+            <w:pPr>
+              <w:spacing w:before="20" w:after="20"/>
+              <w:jc w:val="center"/>
+            </w:pPr>
+            <w:r/>
+            <w:r>
+              <w:rPr>
+                <w:rFonts w:ascii="Calibri" w:hAnsi="Calibri" w:eastAsia="Calibri"/>
+                <w:b w:val="0"/>
+                <w:color w:val="3D4A57"/>
+                <w:sz w:val="16"/>
+              </w:rPr>
+              <w:t>57%</w:t>
+            </w:r>
+          </w:p>
+        </w:tc>
+      </w:tr>
+      <w:tr>
+        <w:tc>
+          <w:tcPr>
+            <w:tcW w:type="dxa" w:w="1361"/>
+            <w:shd w:fill="F4F7FA" w:val="clear"/>
+            <w:tcBorders>
+              <w:top w:val="single" w:sz="4" w:space="0" w:color="C5CDD6"/>
+              <w:left w:val="single" w:sz="4" w:space="0" w:color="C5CDD6"/>
+              <w:bottom w:val="single" w:sz="4" w:space="0" w:color="C5CDD6"/>
+              <w:right w:val="single" w:sz="4" w:space="0" w:color="C5CDD6"/>
+            </w:tcBorders>
+          </w:tcPr>
+          <w:p>
+            <w:pPr>
+              <w:spacing w:before="20" w:after="20"/>
+              <w:jc w:val="left"/>
+            </w:pPr>
+            <w:r/>
+            <w:r>
+              <w:rPr>
+                <w:rFonts w:ascii="Calibri" w:hAnsi="Calibri" w:eastAsia="Calibri"/>
+                <w:b/>
+                <w:color w:val="1B365D"/>
+                <w:sz w:val="16"/>
+              </w:rPr>
+              <w:t>Ø25</w:t>
+            </w:r>
+          </w:p>
+        </w:tc>
+        <w:tc>
+          <w:tcPr>
+            <w:tcW w:type="dxa" w:w="1701"/>
+            <w:shd w:fill="F4F7FA" w:val="clear"/>
+            <w:tcBorders>
+              <w:top w:val="single" w:sz="4" w:space="0" w:color="C5CDD6"/>
+              <w:left w:val="single" w:sz="4" w:space="0" w:color="C5CDD6"/>
+              <w:bottom w:val="single" w:sz="4" w:space="0" w:color="C5CDD6"/>
+              <w:right w:val="single" w:sz="4" w:space="0" w:color="C5CDD6"/>
+            </w:tcBorders>
+          </w:tcPr>
+          <w:p>
+            <w:pPr>
+              <w:spacing w:before="20" w:after="20"/>
+              <w:jc w:val="center"/>
+            </w:pPr>
+            <w:r/>
+            <w:r>
+              <w:rPr>
+                <w:rFonts w:ascii="Calibri" w:hAnsi="Calibri" w:eastAsia="Calibri"/>
+                <w:b w:val="0"/>
+                <w:color w:val="3D4A57"/>
+                <w:sz w:val="16"/>
+              </w:rPr>
+              <w:t>45,294</w:t>
+            </w:r>
+          </w:p>
+        </w:tc>
+        <w:tc>
+          <w:tcPr>
+            <w:tcW w:type="dxa" w:w="1701"/>
+            <w:shd w:fill="F4F7FA" w:val="clear"/>
+            <w:tcBorders>
+              <w:top w:val="single" w:sz="4" w:space="0" w:color="C5CDD6"/>
+              <w:left w:val="single" w:sz="4" w:space="0" w:color="C5CDD6"/>
+              <w:bottom w:val="single" w:sz="4" w:space="0" w:color="C5CDD6"/>
+              <w:right w:val="single" w:sz="4" w:space="0" w:color="C5CDD6"/>
+            </w:tcBorders>
+          </w:tcPr>
+          <w:p>
+            <w:pPr>
+              <w:spacing w:before="20" w:after="20"/>
+              <w:jc w:val="center"/>
+            </w:pPr>
+            <w:r/>
+            <w:r>
+              <w:rPr>
+                <w:rFonts w:ascii="Calibri" w:hAnsi="Calibri" w:eastAsia="Calibri"/>
+                <w:b w:val="0"/>
+                <w:color w:val="3D4A57"/>
+                <w:sz w:val="16"/>
+              </w:rPr>
+              <w:t>28,282</w:t>
+            </w:r>
+          </w:p>
+        </w:tc>
+        <w:tc>
+          <w:tcPr>
+            <w:tcW w:type="dxa" w:w="1587"/>
+            <w:shd w:fill="F4F7FA" w:val="clear"/>
+            <w:tcBorders>
+              <w:top w:val="single" w:sz="4" w:space="0" w:color="C5CDD6"/>
+              <w:left w:val="single" w:sz="4" w:space="0" w:color="C5CDD6"/>
+              <w:bottom w:val="single" w:sz="4" w:space="0" w:color="C5CDD6"/>
+              <w:right w:val="single" w:sz="4" w:space="0" w:color="C5CDD6"/>
+            </w:tcBorders>
+          </w:tcPr>
+          <w:p>
+            <w:pPr>
+              <w:spacing w:before="20" w:after="20"/>
+              <w:jc w:val="center"/>
+            </w:pPr>
+            <w:r/>
+            <w:r>
+              <w:rPr>
+                <w:rFonts w:ascii="Calibri" w:hAnsi="Calibri" w:eastAsia="Calibri"/>
+                <w:b w:val="0"/>
+                <w:color w:val="3D4A57"/>
+                <w:sz w:val="16"/>
+              </w:rPr>
+              <w:t>−17,011</w:t>
+            </w:r>
+          </w:p>
+        </w:tc>
+        <w:tc>
+          <w:tcPr>
+            <w:tcW w:type="dxa" w:w="1361"/>
+            <w:shd w:fill="F4F7FA" w:val="clear"/>
+            <w:tcBorders>
+              <w:top w:val="single" w:sz="4" w:space="0" w:color="C5CDD6"/>
+              <w:left w:val="single" w:sz="4" w:space="0" w:color="C5CDD6"/>
+              <w:bottom w:val="single" w:sz="4" w:space="0" w:color="C5CDD6"/>
+              <w:right w:val="single" w:sz="4" w:space="0" w:color="C5CDD6"/>
+            </w:tcBorders>
+          </w:tcPr>
+          <w:p>
+            <w:pPr>
+              <w:spacing w:before="20" w:after="20"/>
+              <w:jc w:val="center"/>
+            </w:pPr>
+            <w:r/>
+            <w:r>
+              <w:rPr>
+                <w:rFonts w:ascii="Calibri" w:hAnsi="Calibri" w:eastAsia="Calibri"/>
+                <w:b w:val="0"/>
+                <w:color w:val="3D4A57"/>
+                <w:sz w:val="16"/>
+              </w:rPr>
+              <w:t>37.6%</w:t>
+            </w:r>
+          </w:p>
+        </w:tc>
+        <w:tc>
+          <w:tcPr>
+            <w:tcW w:type="dxa" w:w="1928"/>
+            <w:shd w:fill="F4F7FA" w:val="clear"/>
+            <w:tcBorders>
+              <w:top w:val="single" w:sz="4" w:space="0" w:color="C5CDD6"/>
+              <w:left w:val="single" w:sz="4" w:space="0" w:color="C5CDD6"/>
+              <w:bottom w:val="single" w:sz="4" w:space="0" w:color="C5CDD6"/>
+              <w:right w:val="single" w:sz="4" w:space="0" w:color="C5CDD6"/>
+            </w:tcBorders>
+          </w:tcPr>
+          <w:p>
+            <w:pPr>
+              <w:spacing w:before="20" w:after="20"/>
+              <w:jc w:val="center"/>
+            </w:pPr>
+            <w:r/>
+            <w:r>
+              <w:rPr>
+                <w:rFonts w:ascii="Calibri" w:hAnsi="Calibri" w:eastAsia="Calibri"/>
+                <w:b w:val="0"/>
+                <w:color w:val="3D4A57"/>
+                <w:sz w:val="16"/>
+              </w:rPr>
+              <w:t>62%</w:t>
+            </w:r>
+          </w:p>
+        </w:tc>
+      </w:tr>
+      <w:tr>
+        <w:tc>
+          <w:tcPr>
+            <w:tcW w:type="dxa" w:w="1361"/>
+            <w:shd w:fill="FFFFFF" w:val="clear"/>
+            <w:tcBorders>
+              <w:top w:val="single" w:sz="4" w:space="0" w:color="C5CDD6"/>
+              <w:left w:val="single" w:sz="4" w:space="0" w:color="C5CDD6"/>
+              <w:bottom w:val="single" w:sz="4" w:space="0" w:color="C5CDD6"/>
+              <w:right w:val="single" w:sz="4" w:space="0" w:color="C5CDD6"/>
+            </w:tcBorders>
+          </w:tcPr>
+          <w:p>
+            <w:pPr>
+              <w:spacing w:before="20" w:after="20"/>
+              <w:jc w:val="left"/>
+            </w:pPr>
+            <w:r/>
+            <w:r>
+              <w:rPr>
+                <w:rFonts w:ascii="Calibri" w:hAnsi="Calibri" w:eastAsia="Calibri"/>
+                <w:b/>
+                <w:color w:val="1B365D"/>
+                <w:sz w:val="16"/>
+              </w:rPr>
+              <w:t>Ø32</w:t>
+            </w:r>
+          </w:p>
+        </w:tc>
+        <w:tc>
+          <w:tcPr>
+            <w:tcW w:type="dxa" w:w="1701"/>
+            <w:shd w:fill="FFFFFF" w:val="clear"/>
+            <w:tcBorders>
+              <w:top w:val="single" w:sz="4" w:space="0" w:color="C5CDD6"/>
+              <w:left w:val="single" w:sz="4" w:space="0" w:color="C5CDD6"/>
+              <w:bottom w:val="single" w:sz="4" w:space="0" w:color="C5CDD6"/>
+              <w:right w:val="single" w:sz="4" w:space="0" w:color="C5CDD6"/>
+            </w:tcBorders>
+          </w:tcPr>
+          <w:p>
+            <w:pPr>
+              <w:spacing w:before="20" w:after="20"/>
+              <w:jc w:val="center"/>
+            </w:pPr>
+            <w:r/>
+            <w:r>
+              <w:rPr>
+                <w:rFonts w:ascii="Calibri" w:hAnsi="Calibri" w:eastAsia="Calibri"/>
+                <w:b w:val="0"/>
+                <w:color w:val="3D4A57"/>
+                <w:sz w:val="16"/>
+              </w:rPr>
+              <w:t>2,808</w:t>
+            </w:r>
+          </w:p>
+        </w:tc>
+        <w:tc>
+          <w:tcPr>
+            <w:tcW w:type="dxa" w:w="1701"/>
+            <w:shd w:fill="FFFFFF" w:val="clear"/>
+            <w:tcBorders>
+              <w:top w:val="single" w:sz="4" w:space="0" w:color="C5CDD6"/>
+              <w:left w:val="single" w:sz="4" w:space="0" w:color="C5CDD6"/>
+              <w:bottom w:val="single" w:sz="4" w:space="0" w:color="C5CDD6"/>
+              <w:right w:val="single" w:sz="4" w:space="0" w:color="C5CDD6"/>
+            </w:tcBorders>
+          </w:tcPr>
+          <w:p>
+            <w:pPr>
+              <w:spacing w:before="20" w:after="20"/>
+              <w:jc w:val="center"/>
+            </w:pPr>
+            <w:r/>
+            <w:r>
+              <w:rPr>
+                <w:rFonts w:ascii="Calibri" w:hAnsi="Calibri" w:eastAsia="Calibri"/>
+                <w:b w:val="0"/>
+                <w:color w:val="3D4A57"/>
+                <w:sz w:val="16"/>
+              </w:rPr>
+              <w:t>1,901</w:t>
+            </w:r>
+          </w:p>
+        </w:tc>
+        <w:tc>
+          <w:tcPr>
+            <w:tcW w:type="dxa" w:w="1587"/>
+            <w:shd w:fill="FFFFFF" w:val="clear"/>
+            <w:tcBorders>
+              <w:top w:val="single" w:sz="4" w:space="0" w:color="C5CDD6"/>
+              <w:left w:val="single" w:sz="4" w:space="0" w:color="C5CDD6"/>
+              <w:bottom w:val="single" w:sz="4" w:space="0" w:color="C5CDD6"/>
+              <w:right w:val="single" w:sz="4" w:space="0" w:color="C5CDD6"/>
+            </w:tcBorders>
+          </w:tcPr>
+          <w:p>
+            <w:pPr>
+              <w:spacing w:before="20" w:after="20"/>
+              <w:jc w:val="center"/>
+            </w:pPr>
+            <w:r/>
+            <w:r>
+              <w:rPr>
+                <w:rFonts w:ascii="Calibri" w:hAnsi="Calibri" w:eastAsia="Calibri"/>
+                <w:b w:val="0"/>
+                <w:color w:val="3D4A57"/>
+                <w:sz w:val="16"/>
+              </w:rPr>
+              <w:t>−906</w:t>
+            </w:r>
+          </w:p>
+        </w:tc>
+        <w:tc>
+          <w:tcPr>
+            <w:tcW w:type="dxa" w:w="1361"/>
+            <w:shd w:fill="FFFFFF" w:val="clear"/>
+            <w:tcBorders>
+              <w:top w:val="single" w:sz="4" w:space="0" w:color="C5CDD6"/>
+              <w:left w:val="single" w:sz="4" w:space="0" w:color="C5CDD6"/>
+              <w:bottom w:val="single" w:sz="4" w:space="0" w:color="C5CDD6"/>
+              <w:right w:val="single" w:sz="4" w:space="0" w:color="C5CDD6"/>
+            </w:tcBorders>
+          </w:tcPr>
+          <w:p>
+            <w:pPr>
+              <w:spacing w:before="20" w:after="20"/>
+              <w:jc w:val="center"/>
+            </w:pPr>
+            <w:r/>
+            <w:r>
+              <w:rPr>
+                <w:rFonts w:ascii="Calibri" w:hAnsi="Calibri" w:eastAsia="Calibri"/>
+                <w:b w:val="0"/>
+                <w:color w:val="3D4A57"/>
+                <w:sz w:val="16"/>
+              </w:rPr>
+              <w:t>32.3%</w:t>
+            </w:r>
+          </w:p>
+        </w:tc>
+        <w:tc>
+          <w:tcPr>
+            <w:tcW w:type="dxa" w:w="1928"/>
+            <w:shd w:fill="FFFFFF" w:val="clear"/>
+            <w:tcBorders>
+              <w:top w:val="single" w:sz="4" w:space="0" w:color="C5CDD6"/>
+              <w:left w:val="single" w:sz="4" w:space="0" w:color="C5CDD6"/>
+              <w:bottom w:val="single" w:sz="4" w:space="0" w:color="C5CDD6"/>
+              <w:right w:val="single" w:sz="4" w:space="0" w:color="C5CDD6"/>
+            </w:tcBorders>
+          </w:tcPr>
+          <w:p>
+            <w:pPr>
+              <w:spacing w:before="20" w:after="20"/>
+              <w:jc w:val="center"/>
+            </w:pPr>
+            <w:r/>
+            <w:r>
+              <w:rPr>
+                <w:rFonts w:ascii="Calibri" w:hAnsi="Calibri" w:eastAsia="Calibri"/>
+                <w:b w:val="0"/>
+                <w:color w:val="3D4A57"/>
+                <w:sz w:val="16"/>
+              </w:rPr>
+              <w:t>68%</w:t>
+            </w:r>
+          </w:p>
+        </w:tc>
+      </w:tr>
+      <w:tr>
+        <w:tc>
+          <w:tcPr>
+            <w:tcW w:type="dxa" w:w="1361"/>
+            <w:shd w:fill="E8EEF4" w:val="clear"/>
+            <w:tcBorders>
+              <w:top w:val="single" w:sz="4" w:space="0" w:color="C5CDD6"/>
+              <w:left w:val="single" w:sz="4" w:space="0" w:color="C5CDD6"/>
+              <w:bottom w:val="single" w:sz="4" w:space="0" w:color="C5CDD6"/>
+              <w:right w:val="single" w:sz="4" w:space="0" w:color="C5CDD6"/>
+            </w:tcBorders>
+          </w:tcPr>
+          <w:p>
+            <w:pPr>
+              <w:spacing w:before="20" w:after="20"/>
+              <w:jc w:val="left"/>
+            </w:pPr>
+            <w:r/>
+            <w:r>
+              <w:rPr>
+                <w:rFonts w:ascii="Calibri" w:hAnsi="Calibri" w:eastAsia="Calibri"/>
+                <w:b/>
+                <w:color w:val="1B365D"/>
+                <w:sz w:val="16"/>
+              </w:rPr>
+              <w:t>TOTAL</w:t>
+            </w:r>
+          </w:p>
+        </w:tc>
+        <w:tc>
+          <w:tcPr>
+            <w:tcW w:type="dxa" w:w="1701"/>
+            <w:shd w:fill="E8EEF4" w:val="clear"/>
+            <w:tcBorders>
+              <w:top w:val="single" w:sz="4" w:space="0" w:color="C5CDD6"/>
+              <w:left w:val="single" w:sz="4" w:space="0" w:color="C5CDD6"/>
+              <w:bottom w:val="single" w:sz="4" w:space="0" w:color="C5CDD6"/>
+              <w:right w:val="single" w:sz="4" w:space="0" w:color="C5CDD6"/>
+            </w:tcBorders>
+          </w:tcPr>
+          <w:p>
+            <w:pPr>
+              <w:spacing w:before="20" w:after="20"/>
+              <w:jc w:val="center"/>
+            </w:pPr>
+            <w:r/>
+            <w:r>
+              <w:rPr>
+                <w:rFonts w:ascii="Calibri" w:hAnsi="Calibri" w:eastAsia="Calibri"/>
+                <w:b/>
+                <w:color w:val="3D4A57"/>
+                <w:sz w:val="16"/>
+              </w:rPr>
+              <w:t>148,911</w:t>
+            </w:r>
+          </w:p>
+        </w:tc>
+        <w:tc>
+          <w:tcPr>
+            <w:tcW w:type="dxa" w:w="1701"/>
+            <w:shd w:fill="E8EEF4" w:val="clear"/>
+            <w:tcBorders>
+              <w:top w:val="single" w:sz="4" w:space="0" w:color="C5CDD6"/>
+              <w:left w:val="single" w:sz="4" w:space="0" w:color="C5CDD6"/>
+              <w:bottom w:val="single" w:sz="4" w:space="0" w:color="C5CDD6"/>
+              <w:right w:val="single" w:sz="4" w:space="0" w:color="C5CDD6"/>
+            </w:tcBorders>
+          </w:tcPr>
+          <w:p>
+            <w:pPr>
+              <w:spacing w:before="20" w:after="20"/>
+              <w:jc w:val="center"/>
+            </w:pPr>
+            <w:r/>
+            <w:r>
+              <w:rPr>
+                <w:rFonts w:ascii="Calibri" w:hAnsi="Calibri" w:eastAsia="Calibri"/>
+                <w:b/>
+                <w:color w:val="3D4A57"/>
+                <w:sz w:val="16"/>
+              </w:rPr>
+              <w:t>90,303</w:t>
+            </w:r>
+          </w:p>
+        </w:tc>
+        <w:tc>
+          <w:tcPr>
+            <w:tcW w:type="dxa" w:w="1587"/>
+            <w:shd w:fill="E8EEF4" w:val="clear"/>
+            <w:tcBorders>
+              <w:top w:val="single" w:sz="4" w:space="0" w:color="C5CDD6"/>
+              <w:left w:val="single" w:sz="4" w:space="0" w:color="C5CDD6"/>
+              <w:bottom w:val="single" w:sz="4" w:space="0" w:color="C5CDD6"/>
+              <w:right w:val="single" w:sz="4" w:space="0" w:color="C5CDD6"/>
+            </w:tcBorders>
+          </w:tcPr>
+          <w:p>
+            <w:pPr>
+              <w:spacing w:before="20" w:after="20"/>
+              <w:jc w:val="center"/>
+            </w:pPr>
+            <w:r/>
+            <w:r>
+              <w:rPr>
+                <w:rFonts w:ascii="Calibri" w:hAnsi="Calibri" w:eastAsia="Calibri"/>
+                <w:b/>
+                <w:color w:val="3D4A57"/>
+                <w:sz w:val="16"/>
+              </w:rPr>
+              <w:t>−58,607</w:t>
+            </w:r>
+          </w:p>
+        </w:tc>
+        <w:tc>
+          <w:tcPr>
+            <w:tcW w:type="dxa" w:w="1361"/>
+            <w:shd w:fill="E8EEF4" w:val="clear"/>
+            <w:tcBorders>
+              <w:top w:val="single" w:sz="4" w:space="0" w:color="C5CDD6"/>
+              <w:left w:val="single" w:sz="4" w:space="0" w:color="C5CDD6"/>
+              <w:bottom w:val="single" w:sz="4" w:space="0" w:color="C5CDD6"/>
+              <w:right w:val="single" w:sz="4" w:space="0" w:color="C5CDD6"/>
+            </w:tcBorders>
+          </w:tcPr>
+          <w:p>
+            <w:pPr>
+              <w:spacing w:before="20" w:after="20"/>
+              <w:jc w:val="center"/>
+            </w:pPr>
+            <w:r/>
+            <w:r>
+              <w:rPr>
+                <w:rFonts w:ascii="Calibri" w:hAnsi="Calibri" w:eastAsia="Calibri"/>
+                <w:b/>
+                <w:color w:val="3D4A57"/>
+                <w:sz w:val="16"/>
+              </w:rPr>
+              <w:t>39.4%</w:t>
+            </w:r>
+          </w:p>
+        </w:tc>
+        <w:tc>
+          <w:tcPr>
+            <w:tcW w:type="dxa" w:w="1928"/>
+            <w:shd w:fill="E8EEF4" w:val="clear"/>
+            <w:tcBorders>
+              <w:top w:val="single" w:sz="4" w:space="0" w:color="C5CDD6"/>
+              <w:left w:val="single" w:sz="4" w:space="0" w:color="C5CDD6"/>
+              <w:bottom w:val="single" w:sz="4" w:space="0" w:color="C5CDD6"/>
+              <w:right w:val="single" w:sz="4" w:space="0" w:color="C5CDD6"/>
+            </w:tcBorders>
+          </w:tcPr>
+          <w:p>
+            <w:pPr>
+              <w:spacing w:before="20" w:after="20"/>
+              <w:jc w:val="center"/>
+            </w:pPr>
+            <w:r/>
+            <w:r>
+              <w:rPr>
+                <w:rFonts w:ascii="Calibri" w:hAnsi="Calibri" w:eastAsia="Calibri"/>
+                <w:b/>
+                <w:color w:val="3D4A57"/>
+                <w:sz w:val="16"/>
+              </w:rPr>
+              <w:t>61%</w:t>
+            </w:r>
+          </w:p>
+        </w:tc>
+      </w:tr>
+    </w:tbl>
+    <w:p>
+      <w:pPr>
+        <w:spacing w:after="120"/>
+      </w:pPr>
+    </w:p>
+    <w:tbl>
+      <w:tblPr>
+        <w:tblW w:type="dxa" w:w="9639"/>
+        <w:jc w:val="center"/>
+        <w:tblLayout w:type="fixed"/>
+        <w:tblLook w:firstColumn="1" w:firstRow="1" w:lastColumn="0" w:lastRow="0" w:noHBand="0" w:noVBand="1" w:val="04A0"/>
+      </w:tblPr>
+      <w:tblGrid>
+        <w:gridCol w:w="9978"/>
+      </w:tblGrid>
+      <w:tr>
+        <w:tc>
+          <w:tcPr>
+            <w:tcW w:type="dxa" w:w="9638"/>
+            <w:shd w:fill="1B365D" w:val="clear"/>
+            <w:tcBorders>
+              <w:top w:val="single" w:sz="4" w:space="0" w:color="C5CDD6"/>
+              <w:left w:val="single" w:sz="4" w:space="0" w:color="C5CDD6"/>
+              <w:bottom w:val="single" w:sz="4" w:space="0" w:color="C5CDD6"/>
+              <w:right w:val="single" w:sz="4" w:space="0" w:color="C5CDD6"/>
+            </w:tcBorders>
+          </w:tcPr>
+          <w:p>
+            <w:pPr>
+              <w:spacing w:before="20" w:after="20"/>
+              <w:jc w:val="center"/>
+            </w:pPr>
+            <w:r/>
+            <w:r>
+              <w:rPr>
+                <w:rFonts w:ascii="Calibri" w:hAnsi="Calibri" w:eastAsia="Calibri"/>
+                <w:b/>
+                <w:color w:val="FFFFFF"/>
+                <w:sz w:val="22"/>
+              </w:rPr>
+              <w:t>9.  Semantic error profile</w:t>
             </w:r>
           </w:p>
         </w:tc>
@@ -6718,7 +10192,7 @@
                 <w:color w:val="FFFFFF"/>
                 <w:sz w:val="22"/>
               </w:rPr>
-              <w:t>8.  Engineering calculation profile</w:t>
+              <w:t>10.  Engineering calculation profile</w:t>
             </w:r>
           </w:p>
         </w:tc>
@@ -7201,7 +10675,7 @@
                 <w:color w:val="FFFFFF"/>
                 <w:sz w:val="22"/>
               </w:rPr>
-              <w:t>9.  HYBRID / FALLBACK coverage</w:t>
+              <w:t>11.  HYBRID / FALLBACK coverage</w:t>
             </w:r>
           </w:p>
         </w:tc>
@@ -8075,7 +11549,7 @@
                 <w:color w:val="FFFFFF"/>
                 <w:sz w:val="22"/>
               </w:rPr>
-              <w:t>10.  Current workflow value</w:t>
+              <w:t>12.  Current workflow value</w:t>
             </w:r>
           </w:p>
         </w:tc>
@@ -8135,7 +11609,7 @@
                 <w:color w:val="FFFFFF"/>
                 <w:sz w:val="22"/>
               </w:rPr>
-              <w:t>11.  Methodology, sources and limitations</w:t>
+              <w:t>13.  Methodology, sources and limitations</w:t>
             </w:r>
           </w:p>
         </w:tc>

</xml_diff>